<commit_message>
Versão do dia 02/06/2026
</commit_message>
<xml_diff>
--- a/DesenvolvimentoDeSistemas_2026_2_ClaraCostaDoVau_GestorDeMetricasDeTrafego_Diario_De_Bordo (1)-1.docx
+++ b/DesenvolvimentoDeSistemas_2026_2_ClaraCostaDoVau_GestorDeMetricasDeTrafego_Diario_De_Bordo (1)-1.docx
@@ -1,6 +1,6 @@
 
 <file path=word/document.xml><?xml version="1.0" encoding="utf-8"?>
-<w:document xmlns:wpc="http://schemas.microsoft.com/office/word/2010/wordprocessingCanvas" xmlns:cx="http://schemas.microsoft.com/office/drawing/2014/chartex" xmlns:cx1="http://schemas.microsoft.com/office/drawing/2015/9/8/chartex" xmlns:cx2="http://schemas.microsoft.com/office/drawing/2015/10/21/chartex" xmlns:cx3="http://schemas.microsoft.com/office/drawing/2016/5/9/chartex" xmlns:cx4="http://schemas.microsoft.com/office/drawing/2016/5/10/chartex" xmlns:cx5="http://schemas.microsoft.com/office/drawing/2016/5/11/chartex" xmlns:cx6="http://schemas.microsoft.com/office/drawing/2016/5/12/chartex" xmlns:cx7="http://schemas.microsoft.com/office/drawing/2016/5/13/chartex" xmlns:cx8="http://schemas.microsoft.com/office/drawing/2016/5/14/chartex" xmlns:mc="http://schemas.openxmlformats.org/markup-compatibility/2006" xmlns:aink="http://schemas.microsoft.com/office/drawing/2016/ink" xmlns:am3d="http://schemas.microsoft.com/office/drawing/2017/model3d" xmlns:o="urn:schemas-microsoft-com:office:office" xmlns:oel="http://schemas.microsoft.com/office/2019/extlst" xmlns:r="http://schemas.openxmlformats.org/officeDocument/2006/relationships" xmlns:m="http://schemas.openxmlformats.org/officeDocument/2006/math" xmlns:v="urn:schemas-microsoft-com:vml" xmlns:wp14="http://schemas.microsoft.com/office/word/2010/wordprocessingDrawing" xmlns:wp="http://schemas.openxmlformats.org/drawingml/2006/wordprocessingDrawing" xmlns:w10="urn:schemas-microsoft-com:office:word" xmlns:w="http://schemas.openxmlformats.org/wordprocessingml/2006/main" xmlns:w14="http://schemas.microsoft.com/office/word/2010/wordml" xmlns:w15="http://schemas.microsoft.com/office/word/2012/wordml" xmlns:w16cex="http://schemas.microsoft.com/office/word/2018/wordml/cex" xmlns:w16cid="http://schemas.microsoft.com/office/word/2016/wordml/cid" xmlns:w16="http://schemas.microsoft.com/office/word/2018/wordml" xmlns:w16sdtdh="http://schemas.microsoft.com/office/word/2020/wordml/sdtdatahash" xmlns:w16se="http://schemas.microsoft.com/office/word/2015/wordml/symex" xmlns:wpg="http://schemas.microsoft.com/office/word/2010/wordprocessingGroup" xmlns:wpi="http://schemas.microsoft.com/office/word/2010/wordprocessingInk" xmlns:wne="http://schemas.microsoft.com/office/word/2006/wordml" xmlns:wps="http://schemas.microsoft.com/office/word/2010/wordprocessingShape" mc:Ignorable="w14 w15 w16se w16cid w16 w16cex w16sdtdh wp14">
+<w:document xmlns:wpc="http://schemas.microsoft.com/office/word/2010/wordprocessingCanvas" xmlns:cx="http://schemas.microsoft.com/office/drawing/2014/chartex" xmlns:mc="http://schemas.openxmlformats.org/markup-compatibility/2006" xmlns:o="urn:schemas-microsoft-com:office:office" xmlns:r="http://schemas.openxmlformats.org/officeDocument/2006/relationships" xmlns:m="http://schemas.openxmlformats.org/officeDocument/2006/math" xmlns:v="urn:schemas-microsoft-com:vml" xmlns:wp14="http://schemas.microsoft.com/office/word/2010/wordprocessingDrawing" xmlns:wp="http://schemas.openxmlformats.org/drawingml/2006/wordprocessingDrawing" xmlns:w10="urn:schemas-microsoft-com:office:word" xmlns:w="http://schemas.openxmlformats.org/wordprocessingml/2006/main" xmlns:w14="http://schemas.microsoft.com/office/word/2010/wordml" xmlns:w15="http://schemas.microsoft.com/office/word/2012/wordml" xmlns:w16se="http://schemas.microsoft.com/office/word/2015/wordml/symex" xmlns:wpg="http://schemas.microsoft.com/office/word/2010/wordprocessingGroup" xmlns:wpi="http://schemas.microsoft.com/office/word/2010/wordprocessingInk" xmlns:wne="http://schemas.microsoft.com/office/word/2006/wordml" xmlns:wps="http://schemas.microsoft.com/office/word/2010/wordprocessingShape" mc:Ignorable="w14 w15 w16se wp14">
   <w:body>
     <w:p>
       <w:pPr>
@@ -152,196 +152,188 @@
           <w:sz w:val="28"/>
           <w:szCs w:val="28"/>
         </w:rPr>
-        <w:t xml:space="preserve">GESTOR DE </w:t>
-      </w:r>
-      <w:r>
+        <w:t>GESTOR DE MÉTRICAS DE TRÁFEGO</w:t>
+      </w:r>
+    </w:p>
+    <w:p>
+      <w:pPr>
+        <w:spacing w:after="3" w:line="265" w:lineRule="auto"/>
+        <w:ind w:left="0" w:right="684"/>
+        <w:rPr>
+          <w:szCs w:val="24"/>
+        </w:rPr>
+      </w:pPr>
+      <w:r>
+        <w:rPr>
+          <w:szCs w:val="24"/>
+        </w:rPr>
+        <w:t>Amparo – SP</w:t>
+      </w:r>
+      <w:r>
+        <w:rPr>
+          <w:szCs w:val="24"/>
+        </w:rPr>
+        <w:br/>
+        <w:t>2025</w:t>
+      </w:r>
+      <w:r>
+        <w:rPr>
+          <w:szCs w:val="24"/>
+        </w:rPr>
+        <w:br w:type="page"/>
+      </w:r>
+    </w:p>
+    <w:p>
+      <w:pPr>
+        <w:spacing w:after="3" w:line="265" w:lineRule="auto"/>
+        <w:ind w:left="0" w:right="686"/>
+        <w:rPr>
+          <w:szCs w:val="24"/>
+        </w:rPr>
+      </w:pPr>
+      <w:r>
+        <w:rPr>
+          <w:szCs w:val="24"/>
+        </w:rPr>
+        <w:lastRenderedPageBreak/>
+        <w:t>CENTRO PAULA SOUZA</w:t>
+      </w:r>
+      <w:r>
+        <w:rPr>
+          <w:szCs w:val="24"/>
+        </w:rPr>
+        <w:br/>
+        <w:t>ETEC JOÃO BELARMINO</w:t>
+      </w:r>
+      <w:r>
+        <w:rPr>
+          <w:szCs w:val="24"/>
+        </w:rPr>
+        <w:br/>
+        <w:t>Ensino-Médio com Habilitação Profissional de Técnico em Desenvolvimento de Sistemas</w:t>
+      </w:r>
+    </w:p>
+    <w:p>
+      <w:pPr>
         <w:rPr>
           <w:b/>
           <w:sz w:val="28"/>
           <w:szCs w:val="28"/>
         </w:rPr>
-        <w:t>MÉTRICAS DE TRÁFEGO</w:t>
-      </w:r>
-    </w:p>
-    <w:p>
-      <w:pPr>
-        <w:spacing w:after="3" w:line="265" w:lineRule="auto"/>
-        <w:ind w:left="0" w:right="684"/>
-        <w:rPr>
-          <w:szCs w:val="24"/>
-        </w:rPr>
-      </w:pPr>
-      <w:r>
-        <w:rPr>
-          <w:szCs w:val="24"/>
-        </w:rPr>
-        <w:t>Amparo – SP</w:t>
-      </w:r>
-      <w:r>
-        <w:rPr>
-          <w:szCs w:val="24"/>
-        </w:rPr>
-        <w:br/>
-        <w:t>2025</w:t>
-      </w:r>
-      <w:r>
-        <w:rPr>
-          <w:szCs w:val="24"/>
-        </w:rPr>
-        <w:br w:type="page"/>
-      </w:r>
-    </w:p>
-    <w:p>
-      <w:pPr>
-        <w:spacing w:after="3" w:line="265" w:lineRule="auto"/>
-        <w:ind w:left="0" w:right="686"/>
-        <w:rPr>
-          <w:szCs w:val="24"/>
-        </w:rPr>
-      </w:pPr>
-      <w:r>
-        <w:rPr>
-          <w:szCs w:val="24"/>
-        </w:rPr>
-        <w:lastRenderedPageBreak/>
-        <w:t>CENTRO PAULA SOUZA</w:t>
-      </w:r>
-      <w:r>
-        <w:rPr>
-          <w:szCs w:val="24"/>
-        </w:rPr>
-        <w:br/>
-        <w:t>ETEC JOÃO BELARMINO</w:t>
-      </w:r>
-      <w:r>
-        <w:rPr>
-          <w:szCs w:val="24"/>
-        </w:rPr>
-        <w:br/>
-        <w:t>Ensino-Médio com Habilitação Profissional de Técnico em Desenvolvimento de Sistemas</w:t>
-      </w:r>
-    </w:p>
-    <w:p>
-      <w:pPr>
+      </w:pPr>
+      <w:r>
         <w:rPr>
           <w:b/>
           <w:sz w:val="28"/>
           <w:szCs w:val="28"/>
         </w:rPr>
-      </w:pPr>
+        <w:t>Clara Costa do Vau</w:t>
+      </w:r>
       <w:r>
         <w:rPr>
           <w:b/>
           <w:sz w:val="28"/>
           <w:szCs w:val="28"/>
         </w:rPr>
-        <w:t>Clara Costa do Vau</w:t>
-      </w:r>
+        <w:br/>
+        <w:t xml:space="preserve">Davi </w:t>
+      </w:r>
+      <w:proofErr w:type="spellStart"/>
       <w:r>
         <w:rPr>
           <w:b/>
           <w:sz w:val="28"/>
           <w:szCs w:val="28"/>
         </w:rPr>
-        <w:br/>
-        <w:t xml:space="preserve">Davi </w:t>
-      </w:r>
-      <w:proofErr w:type="spellStart"/>
+        <w:t>Pavam</w:t>
+      </w:r>
+      <w:proofErr w:type="spellEnd"/>
       <w:r>
         <w:rPr>
           <w:b/>
           <w:sz w:val="28"/>
           <w:szCs w:val="28"/>
         </w:rPr>
-        <w:t>Pavam</w:t>
-      </w:r>
-      <w:proofErr w:type="spellEnd"/>
+        <w:t xml:space="preserve"> Scavassa</w:t>
+      </w:r>
       <w:r>
         <w:rPr>
           <w:b/>
           <w:sz w:val="28"/>
           <w:szCs w:val="28"/>
         </w:rPr>
-        <w:t xml:space="preserve"> Scavassa</w:t>
-      </w:r>
+        <w:br/>
+        <w:t xml:space="preserve">Enrico </w:t>
+      </w:r>
+      <w:proofErr w:type="spellStart"/>
       <w:r>
         <w:rPr>
           <w:b/>
           <w:sz w:val="28"/>
           <w:szCs w:val="28"/>
         </w:rPr>
-        <w:br/>
-        <w:t xml:space="preserve">Enrico </w:t>
-      </w:r>
-      <w:proofErr w:type="spellStart"/>
+        <w:t>Fedel</w:t>
+      </w:r>
+      <w:proofErr w:type="spellEnd"/>
       <w:r>
         <w:rPr>
           <w:b/>
           <w:sz w:val="28"/>
           <w:szCs w:val="28"/>
         </w:rPr>
-        <w:t>Fedel</w:t>
-      </w:r>
-      <w:proofErr w:type="spellEnd"/>
+        <w:t xml:space="preserve"> Outeiro Pinto</w:t>
+      </w:r>
       <w:r>
         <w:rPr>
           <w:b/>
           <w:sz w:val="28"/>
           <w:szCs w:val="28"/>
         </w:rPr>
-        <w:t xml:space="preserve"> Outeiro Pinto</w:t>
-      </w:r>
+        <w:br/>
+        <w:t xml:space="preserve">Felipe </w:t>
+      </w:r>
+      <w:proofErr w:type="spellStart"/>
       <w:r>
         <w:rPr>
           <w:b/>
           <w:sz w:val="28"/>
           <w:szCs w:val="28"/>
         </w:rPr>
-        <w:br/>
-        <w:t xml:space="preserve">Felipe </w:t>
-      </w:r>
-      <w:proofErr w:type="spellStart"/>
+        <w:t>Branchini</w:t>
+      </w:r>
+      <w:proofErr w:type="spellEnd"/>
       <w:r>
         <w:rPr>
           <w:b/>
           <w:sz w:val="28"/>
           <w:szCs w:val="28"/>
         </w:rPr>
-        <w:t>Branchini</w:t>
-      </w:r>
-      <w:proofErr w:type="spellEnd"/>
+        <w:t xml:space="preserve"> Rodrigues</w:t>
+      </w:r>
       <w:r>
         <w:rPr>
           <w:b/>
           <w:sz w:val="28"/>
           <w:szCs w:val="28"/>
         </w:rPr>
-        <w:t xml:space="preserve"> Rodrigues</w:t>
-      </w:r>
-      <w:r>
+        <w:br/>
+        <w:t>Gabriel Oliveira de Lima</w:t>
+      </w:r>
+    </w:p>
+    <w:p>
+      <w:pPr>
         <w:rPr>
           <w:b/>
           <w:sz w:val="28"/>
           <w:szCs w:val="28"/>
         </w:rPr>
-        <w:br/>
-        <w:t>Gabriel Oliveira de Lima</w:t>
-      </w:r>
-    </w:p>
-    <w:p>
-      <w:pPr>
+      </w:pPr>
+      <w:r>
         <w:rPr>
           <w:b/>
           <w:sz w:val="28"/>
           <w:szCs w:val="28"/>
         </w:rPr>
-      </w:pPr>
-      <w:r>
-        <w:rPr>
-          <w:b/>
-          <w:sz w:val="28"/>
-          <w:szCs w:val="28"/>
-        </w:rPr>
         <w:t>GESTOR DE MÉTRICAS DE TRÁFEGO</w:t>
       </w:r>
     </w:p>
@@ -372,7 +364,21 @@
         <w:rPr>
           <w:szCs w:val="24"/>
         </w:rPr>
-        <w:t xml:space="preserve"> João Belarmino orientado pelo Prof. Emerson Rodrigo Baião, como requisito mínimo para obtenção do título de técnico em informática </w:t>
+        <w:t xml:space="preserve"> João </w:t>
+      </w:r>
+      <w:proofErr w:type="spellStart"/>
+      <w:r>
+        <w:rPr>
+          <w:szCs w:val="24"/>
+        </w:rPr>
+        <w:t>Belarmino</w:t>
+      </w:r>
+      <w:proofErr w:type="spellEnd"/>
+      <w:r>
+        <w:rPr>
+          <w:szCs w:val="24"/>
+        </w:rPr>
+        <w:t xml:space="preserve"> orientado pelo Prof. Emerson Rodrigo Baião, como requisito mínimo para obtenção do título de técnico em informática </w:t>
       </w:r>
     </w:p>
     <w:p>
@@ -447,6 +453,7 @@
         <w:rPr>
           <w:b/>
         </w:rPr>
+        <w:lastRenderedPageBreak/>
         <w:t>LISTA DE FIGURAS</w:t>
       </w:r>
     </w:p>
@@ -2138,6 +2145,7 @@
           <w:b/>
           <w:i/>
         </w:rPr>
+        <w:lastRenderedPageBreak/>
         <w:t>SUMÁRIO</w:t>
       </w:r>
       <w:r>
@@ -4138,6 +4146,7 @@
       <w:bookmarkStart w:id="1" w:name="_Toc224030837"/>
       <w:bookmarkStart w:id="2" w:name="_Toc229427494"/>
       <w:r>
+        <w:lastRenderedPageBreak/>
         <w:t xml:space="preserve">Aula dia 10/02/2026 - </w:t>
       </w:r>
       <w:r>
@@ -4398,6 +4407,7 @@
       <w:bookmarkStart w:id="11" w:name="_Toc224632231"/>
       <w:bookmarkStart w:id="12" w:name="_Toc229427469"/>
       <w:r>
+        <w:lastRenderedPageBreak/>
         <w:t xml:space="preserve">Figura </w:t>
       </w:r>
       <w:r>
@@ -4416,9 +4426,6 @@
         <w:t>1</w:t>
       </w:r>
       <w:r>
-        <w:rPr>
-          <w:noProof/>
-        </w:rPr>
         <w:fldChar w:fldCharType="end"/>
       </w:r>
       <w:r>
@@ -4550,10 +4557,7 @@
         <w:pStyle w:val="ParagrafoTCC2025"/>
       </w:pPr>
       <w:r>
-        <w:t xml:space="preserve">O </w:t>
-      </w:r>
-      <w:r>
-        <w:t>professor disponibilizou a documentação e o diário de bordo para que os grupos pudessem compreender o conteúdo de ambos. Na Figura 2 é possível verificar os documentos.</w:t>
+        <w:t>O professor disponibilizou a documentação e o diário de bordo para que os grupos pudessem compreender o conteúdo de ambos. Na Figura 2 é possível verificar os documentos.</w:t>
       </w:r>
     </w:p>
     <w:p>
@@ -4581,9 +4585,6 @@
         <w:t>2</w:t>
       </w:r>
       <w:r>
-        <w:rPr>
-          <w:noProof/>
-        </w:rPr>
         <w:fldChar w:fldCharType="end"/>
       </w:r>
       <w:r>
@@ -4665,6 +4666,7 @@
         <w:pStyle w:val="ParagrafoTCC2025"/>
       </w:pPr>
       <w:r>
+        <w:lastRenderedPageBreak/>
         <w:t>Também foi dado continuidade as conversas por grupo sobre a viabilidade do tema de cada equipe</w:t>
       </w:r>
     </w:p>
@@ -4701,10 +4703,7 @@
         <w:pStyle w:val="ParagrafoTCC2025"/>
       </w:pPr>
       <w:r>
-        <w:t xml:space="preserve">O professor separou os grupos para orienta-los sobre a configuração de diário de bordo para os alunos com </w:t>
-      </w:r>
-      <w:r>
-        <w:t>essa responsabilidade.</w:t>
+        <w:t>O professor separou os grupos para orienta-los sobre a configuração de diário de bordo para os alunos com essa responsabilidade.</w:t>
       </w:r>
     </w:p>
     <w:p>
@@ -4780,9 +4779,6 @@
         <w:t>3</w:t>
       </w:r>
       <w:r>
-        <w:rPr>
-          <w:noProof/>
-        </w:rPr>
         <w:fldChar w:fldCharType="end"/>
       </w:r>
       <w:r>
@@ -4874,6 +4870,7 @@
       </w:pPr>
       <w:bookmarkStart w:id="26" w:name="_Toc229427503"/>
       <w:r>
+        <w:lastRenderedPageBreak/>
         <w:t>Aula dia 16/03/2026 – Formatação da documentação e prototipação</w:t>
       </w:r>
       <w:bookmarkEnd w:id="26"/>
@@ -4942,9 +4939,6 @@
         <w:t>4</w:t>
       </w:r>
       <w:r>
-        <w:rPr>
-          <w:noProof/>
-        </w:rPr>
         <w:fldChar w:fldCharType="end"/>
       </w:r>
       <w:r>
@@ -5103,6 +5097,7 @@
       </w:pPr>
       <w:bookmarkStart w:id="30" w:name="_Toc229427506"/>
       <w:r>
+        <w:lastRenderedPageBreak/>
         <w:t xml:space="preserve">Aula dia 24/03/2026 – Decisão do nome do </w:t>
       </w:r>
       <w:r>
@@ -5185,10 +5180,7 @@
         <w:pStyle w:val="ParagrafoTCC2025"/>
       </w:pPr>
       <w:r>
-        <w:t xml:space="preserve">Nessa aula, foi dado continuidade a </w:t>
-      </w:r>
-      <w:r>
-        <w:t>formatação da documentação pelo Prof. Emerson.</w:t>
+        <w:t>Nessa aula, foi dado continuidade a formatação da documentação pelo Prof. Emerson.</w:t>
       </w:r>
     </w:p>
     <w:p>
@@ -5232,9 +5224,6 @@
         <w:t>5</w:t>
       </w:r>
       <w:r>
-        <w:rPr>
-          <w:noProof/>
-        </w:rPr>
         <w:fldChar w:fldCharType="end"/>
       </w:r>
       <w:r>
@@ -5313,6 +5302,7 @@
       </w:pPr>
       <w:bookmarkStart w:id="33" w:name="_Toc229427474"/>
       <w:r>
+        <w:lastRenderedPageBreak/>
         <w:t xml:space="preserve">Figura </w:t>
       </w:r>
       <w:r>
@@ -5331,9 +5321,6 @@
         <w:t>6</w:t>
       </w:r>
       <w:r>
-        <w:rPr>
-          <w:noProof/>
-        </w:rPr>
         <w:fldChar w:fldCharType="end"/>
       </w:r>
       <w:r>
@@ -5448,7 +5435,15 @@
         <w:pStyle w:val="ParagrafoTCC2025"/>
       </w:pPr>
       <w:r>
-        <w:t>Nesse dia, fora do horário de aula, a aluna Clara Costa do Vau, formalizou em um arquivo de texto os requisitos funcionais e não-funcionais que o sistema terá que atender. Segue abaixo um print do documento:</w:t>
+        <w:t xml:space="preserve">Nesse dia, fora do horário de aula, a aluna Clara Costa do Vau, formalizou em um arquivo de texto os requisitos funcionais e não-funcionais que o sistema terá que atender. Segue abaixo um </w:t>
+      </w:r>
+      <w:proofErr w:type="spellStart"/>
+      <w:r>
+        <w:t>print</w:t>
+      </w:r>
+      <w:proofErr w:type="spellEnd"/>
+      <w:r>
+        <w:t xml:space="preserve"> do documento:</w:t>
       </w:r>
     </w:p>
     <w:p>
@@ -5457,6 +5452,7 @@
       </w:pPr>
       <w:bookmarkStart w:id="36" w:name="_Toc229427475"/>
       <w:r>
+        <w:lastRenderedPageBreak/>
         <w:t xml:space="preserve">Figura </w:t>
       </w:r>
       <w:r>
@@ -5475,9 +5471,6 @@
         <w:t>7</w:t>
       </w:r>
       <w:r>
-        <w:rPr>
-          <w:noProof/>
-        </w:rPr>
         <w:fldChar w:fldCharType="end"/>
       </w:r>
       <w:r>
@@ -5609,6 +5602,7 @@
       </w:pPr>
       <w:bookmarkStart w:id="39" w:name="_Toc229427476"/>
       <w:r>
+        <w:lastRenderedPageBreak/>
         <w:t xml:space="preserve">Figura </w:t>
       </w:r>
       <w:r>
@@ -5627,9 +5621,6 @@
         <w:t>8</w:t>
       </w:r>
       <w:r>
-        <w:rPr>
-          <w:noProof/>
-        </w:rPr>
         <w:fldChar w:fldCharType="end"/>
       </w:r>
       <w:r>
@@ -5737,9 +5728,6 @@
         <w:t>9</w:t>
       </w:r>
       <w:r>
-        <w:rPr>
-          <w:noProof/>
-        </w:rPr>
         <w:fldChar w:fldCharType="end"/>
       </w:r>
       <w:r>
@@ -5829,6 +5817,7 @@
       </w:pPr>
       <w:bookmarkStart w:id="41" w:name="_Toc229427478"/>
       <w:r>
+        <w:lastRenderedPageBreak/>
         <w:t xml:space="preserve">Figura </w:t>
       </w:r>
       <w:r>
@@ -5847,9 +5836,6 @@
         <w:t>10</w:t>
       </w:r>
       <w:r>
-        <w:rPr>
-          <w:noProof/>
-        </w:rPr>
         <w:fldChar w:fldCharType="end"/>
       </w:r>
       <w:r>
@@ -5930,7 +5916,15 @@
         <w:pStyle w:val="ParagrafoTCC2025"/>
       </w:pPr>
       <w:r>
-        <w:t>Esses foram somente alguns prints das principais funcionalidades de nosso sistema.</w:t>
+        <w:t xml:space="preserve">Esses foram somente alguns </w:t>
+      </w:r>
+      <w:proofErr w:type="spellStart"/>
+      <w:r>
+        <w:t>prints</w:t>
+      </w:r>
+      <w:proofErr w:type="spellEnd"/>
+      <w:r>
+        <w:t xml:space="preserve"> das principais funcionalidades de nosso sistema.</w:t>
       </w:r>
     </w:p>
     <w:p>
@@ -5939,10 +5933,7 @@
       </w:pPr>
       <w:bookmarkStart w:id="42" w:name="_Toc229427512"/>
       <w:r>
-        <w:t xml:space="preserve">Dia 12/04/2026 – Desenvolvimento do DER </w:t>
-      </w:r>
-      <w:r>
-        <w:t>lógico do BD</w:t>
+        <w:t>Dia 12/04/2026 – Desenvolvimento do DER lógico do BD</w:t>
       </w:r>
       <w:bookmarkEnd w:id="42"/>
     </w:p>
@@ -6003,9 +5994,6 @@
         <w:t>11</w:t>
       </w:r>
       <w:r>
-        <w:rPr>
-          <w:noProof/>
-        </w:rPr>
         <w:fldChar w:fldCharType="end"/>
       </w:r>
       <w:r>
@@ -6088,6 +6076,7 @@
         <w:pStyle w:val="ParagrafoTCC2025"/>
       </w:pPr>
       <w:r>
+        <w:lastRenderedPageBreak/>
         <w:t>O DER foi desenvolvido com base no levantamento de requisitos que fizemos anteriormente.</w:t>
       </w:r>
     </w:p>
@@ -6141,9 +6130,6 @@
         <w:t>12</w:t>
       </w:r>
       <w:r>
-        <w:rPr>
-          <w:noProof/>
-        </w:rPr>
         <w:fldChar w:fldCharType="end"/>
       </w:r>
       <w:r>
@@ -6263,31 +6249,23 @@
         <w:rPr>
           <w:i/>
         </w:rPr>
-        <w:t>Front-</w:t>
+        <w:t>Front-end</w:t>
+      </w:r>
+      <w:r>
+        <w:t xml:space="preserve"> e o Felipe </w:t>
       </w:r>
       <w:proofErr w:type="spellStart"/>
       <w:r>
+        <w:t>Branchini</w:t>
+      </w:r>
+      <w:proofErr w:type="spellEnd"/>
+      <w:r>
+        <w:t xml:space="preserve"> com o Gabriel Oliveira, do </w:t>
+      </w:r>
+      <w:r>
         <w:rPr>
           <w:i/>
         </w:rPr>
-        <w:t>end</w:t>
-      </w:r>
-      <w:proofErr w:type="spellEnd"/>
-      <w:r>
-        <w:t xml:space="preserve"> e o Felipe </w:t>
-      </w:r>
-      <w:proofErr w:type="spellStart"/>
-      <w:r>
-        <w:t>Branchini</w:t>
-      </w:r>
-      <w:proofErr w:type="spellEnd"/>
-      <w:r>
-        <w:t xml:space="preserve"> com o Gabriel Oliveira, do </w:t>
-      </w:r>
-      <w:r>
-        <w:rPr>
-          <w:i/>
-        </w:rPr>
         <w:t>Back-end.</w:t>
       </w:r>
     </w:p>
@@ -6305,6 +6283,7 @@
       </w:pPr>
       <w:bookmarkStart w:id="47" w:name="_Toc229427515"/>
       <w:r>
+        <w:lastRenderedPageBreak/>
         <w:t>Aula dia 20/04/206 – Ponto facultativo</w:t>
       </w:r>
       <w:bookmarkEnd w:id="47"/>
@@ -6386,9 +6365,6 @@
         <w:t>13</w:t>
       </w:r>
       <w:r>
-        <w:rPr>
-          <w:noProof/>
-        </w:rPr>
         <w:fldChar w:fldCharType="end"/>
       </w:r>
       <w:r>
@@ -6452,7 +6428,11 @@
         <w:pStyle w:val="ParagrafoTCC2025"/>
       </w:pPr>
       <w:r>
-        <w:t>Para o desenvolvimento do código foi utilizado a IDE MySQL, porém, no nosso ambiente escolar, onde estamos desenvolvendo a maior parte de nosso TCC, só temos a disponibilidade da IDE SQL Server, por esse motivo, temos que fazer algumas alterações no código mostrado acima.</w:t>
+        <w:t xml:space="preserve">Para o desenvolvimento do código foi utilizado a IDE MySQL, porém, no nosso ambiente escolar, onde estamos desenvolvendo a maior parte de nosso TCC, só temos a </w:t>
+      </w:r>
+      <w:r>
+        <w:lastRenderedPageBreak/>
+        <w:t>disponibilidade da IDE SQL Server, por esse motivo, temos que fazer algumas alterações no código mostrado acima.</w:t>
       </w:r>
     </w:p>
     <w:p>
@@ -6468,7 +6448,15 @@
       </w:r>
       <w:proofErr w:type="spellEnd"/>
       <w:r>
-        <w:t>, um e-mail contendo um arquivo sobre como apresentar a Arquitetura Física e a Arquitetura Lógica para a melhor leitura e facilitar a maneira de se entender o contexto geral do projeto nessas áreas de uma maneira simples, na imagem abaixo está uma print da tela do e-mail do Heitor.</w:t>
+        <w:t xml:space="preserve">, um e-mail contendo um arquivo sobre como apresentar a Arquitetura Física e a Arquitetura Lógica para a melhor leitura e facilitar a maneira de se entender o contexto geral do projeto nessas áreas de uma maneira simples, na imagem abaixo está uma </w:t>
+      </w:r>
+      <w:proofErr w:type="spellStart"/>
+      <w:r>
+        <w:t>print</w:t>
+      </w:r>
+      <w:proofErr w:type="spellEnd"/>
+      <w:r>
+        <w:t xml:space="preserve"> da tela do e-mail do Heitor.</w:t>
       </w:r>
     </w:p>
     <w:p>
@@ -6495,9 +6483,6 @@
         <w:t>14</w:t>
       </w:r>
       <w:r>
-        <w:rPr>
-          <w:noProof/>
-        </w:rPr>
         <w:fldChar w:fldCharType="end"/>
       </w:r>
       <w:r>
@@ -6584,45 +6569,38 @@
       </w:pPr>
       <w:bookmarkStart w:id="52" w:name="_Toc229427518"/>
       <w:r>
+        <w:lastRenderedPageBreak/>
         <w:t xml:space="preserve">Dia 26/02/2026 – Continuação do </w:t>
       </w:r>
       <w:r>
         <w:rPr>
           <w:i/>
         </w:rPr>
-        <w:t>Front-</w:t>
+        <w:t>Front-end</w:t>
+      </w:r>
+      <w:bookmarkEnd w:id="52"/>
+    </w:p>
+    <w:p>
+      <w:pPr>
+        <w:pStyle w:val="ParagrafoTCC2025"/>
+      </w:pPr>
+      <w:r>
+        <w:t xml:space="preserve">Nesse dia, a aluna Clara do Vau continuou o desenvolvimento do front-end, ainda não está sendo possível visualizar o progresso do desenvolvimento, porém abaixo estão os </w:t>
       </w:r>
       <w:proofErr w:type="spellStart"/>
       <w:r>
-        <w:rPr>
-          <w:i/>
-        </w:rPr>
-        <w:t>end</w:t>
-      </w:r>
-      <w:bookmarkEnd w:id="52"/>
+        <w:t>prints</w:t>
+      </w:r>
       <w:proofErr w:type="spellEnd"/>
+      <w:r>
+        <w:t xml:space="preserve"> dos códigos feitas para a visualização da página inicial.</w:t>
+      </w:r>
     </w:p>
     <w:p>
       <w:pPr>
         <w:pStyle w:val="ParagrafoTCC2025"/>
       </w:pPr>
       <w:r>
-        <w:t>Nesse dia, a aluna Clara do Vau continuou o desenvolvimento do front-</w:t>
-      </w:r>
-      <w:proofErr w:type="spellStart"/>
-      <w:r>
-        <w:t>end</w:t>
-      </w:r>
-      <w:proofErr w:type="spellEnd"/>
-      <w:r>
-        <w:t>, ainda não está sendo possível visualizar o progresso do desenvolvimento, porém abaixo estão os prints dos códigos feitas para a visualização da página inicial.</w:t>
-      </w:r>
-    </w:p>
-    <w:p>
-      <w:pPr>
-        <w:pStyle w:val="ParagrafoTCC2025"/>
-      </w:pPr>
-      <w:r>
         <w:t>Abaixo está a imagem do código da barra lateral:</w:t>
       </w:r>
     </w:p>
@@ -6650,9 +6628,6 @@
         <w:t>15</w:t>
       </w:r>
       <w:r>
-        <w:rPr>
-          <w:noProof/>
-        </w:rPr>
         <w:fldChar w:fldCharType="end"/>
       </w:r>
       <w:r>
@@ -6725,7 +6700,15 @@
         <w:pStyle w:val="ParagrafoTCC2025"/>
       </w:pPr>
       <w:r>
-        <w:t>A seguir, o código da dashboard:</w:t>
+        <w:t xml:space="preserve">A seguir, o código da </w:t>
+      </w:r>
+      <w:proofErr w:type="spellStart"/>
+      <w:r>
+        <w:t>dashboard</w:t>
+      </w:r>
+      <w:proofErr w:type="spellEnd"/>
+      <w:r>
+        <w:t>:</w:t>
       </w:r>
     </w:p>
     <w:p>
@@ -6734,6 +6717,7 @@
       </w:pPr>
       <w:bookmarkStart w:id="54" w:name="_Toc229427484"/>
       <w:r>
+        <w:lastRenderedPageBreak/>
         <w:t xml:space="preserve">Figura </w:t>
       </w:r>
       <w:r>
@@ -6752,13 +6736,18 @@
         <w:t>16</w:t>
       </w:r>
       <w:r>
-        <w:rPr>
-          <w:noProof/>
-        </w:rPr>
         <w:fldChar w:fldCharType="end"/>
       </w:r>
       <w:r>
-        <w:t xml:space="preserve"> - Código da Dashboard (Tela principal)</w:t>
+        <w:t xml:space="preserve"> - Código da </w:t>
+      </w:r>
+      <w:proofErr w:type="spellStart"/>
+      <w:r>
+        <w:t>Dashboard</w:t>
+      </w:r>
+      <w:proofErr w:type="spellEnd"/>
+      <w:r>
+        <w:t xml:space="preserve"> (Tela principal)</w:t>
       </w:r>
       <w:bookmarkEnd w:id="54"/>
     </w:p>
@@ -6816,10 +6805,7 @@
         <w:pStyle w:val="FonteTCC2025"/>
       </w:pPr>
       <w:r>
-        <w:t xml:space="preserve">Fonte: Print tirada pelo Davi </w:t>
-      </w:r>
-      <w:r>
-        <w:t>Scavassa</w:t>
+        <w:t>Fonte: Print tirada pelo Davi Scavassa</w:t>
       </w:r>
     </w:p>
     <w:p>
@@ -6854,21 +6840,10 @@
         <w:t>17</w:t>
       </w:r>
       <w:r>
-        <w:rPr>
-          <w:noProof/>
-        </w:rPr>
         <w:fldChar w:fldCharType="end"/>
       </w:r>
       <w:r>
-        <w:t xml:space="preserve"> - Código </w:t>
-      </w:r>
-      <w:proofErr w:type="gramStart"/>
-      <w:r>
-        <w:t>CSS  (</w:t>
-      </w:r>
-      <w:proofErr w:type="gramEnd"/>
-      <w:r>
-        <w:t>Tela principal)</w:t>
+        <w:t xml:space="preserve"> - Código CSS  (Tela principal)</w:t>
       </w:r>
       <w:bookmarkEnd w:id="55"/>
     </w:p>
@@ -6954,6 +6929,7 @@
       </w:pPr>
       <w:bookmarkStart w:id="56" w:name="_Toc229427486"/>
       <w:r>
+        <w:lastRenderedPageBreak/>
         <w:t xml:space="preserve">Figura </w:t>
       </w:r>
       <w:r>
@@ -6972,9 +6948,6 @@
         <w:t>18</w:t>
       </w:r>
       <w:r>
-        <w:rPr>
-          <w:noProof/>
-        </w:rPr>
         <w:fldChar w:fldCharType="end"/>
       </w:r>
       <w:r>
@@ -7116,6 +7089,7 @@
       </w:pPr>
       <w:bookmarkStart w:id="58" w:name="_Toc229427487"/>
       <w:r>
+        <w:lastRenderedPageBreak/>
         <w:t xml:space="preserve">Figura </w:t>
       </w:r>
       <w:r>
@@ -7134,9 +7108,6 @@
         <w:t>19</w:t>
       </w:r>
       <w:r>
-        <w:rPr>
-          <w:noProof/>
-        </w:rPr>
         <w:fldChar w:fldCharType="end"/>
       </w:r>
       <w:r>
@@ -7233,9 +7204,6 @@
         <w:t>20</w:t>
       </w:r>
       <w:r>
-        <w:rPr>
-          <w:noProof/>
-        </w:rPr>
         <w:fldChar w:fldCharType="end"/>
       </w:r>
       <w:r>
@@ -7320,6 +7288,7 @@
       </w:pPr>
       <w:bookmarkStart w:id="60" w:name="_Toc229427489"/>
       <w:r>
+        <w:lastRenderedPageBreak/>
         <w:t xml:space="preserve">Figura </w:t>
       </w:r>
       <w:r>
@@ -7338,9 +7307,6 @@
         <w:t>21</w:t>
       </w:r>
       <w:r>
-        <w:rPr>
-          <w:noProof/>
-        </w:rPr>
         <w:fldChar w:fldCharType="end"/>
       </w:r>
       <w:r>
@@ -7437,9 +7403,6 @@
         <w:t>22</w:t>
       </w:r>
       <w:r>
-        <w:rPr>
-          <w:noProof/>
-        </w:rPr>
         <w:fldChar w:fldCharType="end"/>
       </w:r>
       <w:r>
@@ -7519,45 +7482,30 @@
       </w:pPr>
       <w:bookmarkStart w:id="62" w:name="_Toc229427520"/>
       <w:r>
+        <w:lastRenderedPageBreak/>
         <w:t xml:space="preserve">Aula dia 28/04/2026 – Análise minuciosa do </w:t>
       </w:r>
       <w:r>
         <w:rPr>
           <w:i/>
         </w:rPr>
-        <w:t>Front-</w:t>
-      </w:r>
-      <w:proofErr w:type="spellStart"/>
+        <w:t>Front-end</w:t>
+      </w:r>
+      <w:bookmarkEnd w:id="62"/>
+    </w:p>
+    <w:p>
+      <w:pPr>
+        <w:pStyle w:val="ParagrafoTCC2025"/>
+      </w:pPr>
+      <w:r>
+        <w:t xml:space="preserve">Fizemos uma análise melhor do </w:t>
+      </w:r>
       <w:r>
         <w:rPr>
           <w:i/>
         </w:rPr>
-        <w:t>end</w:t>
-      </w:r>
-      <w:bookmarkEnd w:id="62"/>
-      <w:proofErr w:type="spellEnd"/>
-    </w:p>
-    <w:p>
-      <w:pPr>
-        <w:pStyle w:val="ParagrafoTCC2025"/>
-      </w:pPr>
-      <w:r>
-        <w:t xml:space="preserve">Fizemos uma análise melhor do </w:t>
-      </w:r>
-      <w:r>
-        <w:rPr>
-          <w:i/>
-        </w:rPr>
-        <w:t>front-</w:t>
-      </w:r>
-      <w:proofErr w:type="spellStart"/>
-      <w:r>
-        <w:rPr>
-          <w:i/>
-        </w:rPr>
-        <w:t>end</w:t>
-      </w:r>
-      <w:proofErr w:type="spellEnd"/>
+        <w:t>front-end</w:t>
+      </w:r>
       <w:r>
         <w:t xml:space="preserve"> do sistema, agora é possível visualizar o progresso do desenvolvimento da tela conforme na imagem abaixo.</w:t>
       </w:r>
@@ -7587,9 +7535,6 @@
         <w:t>23</w:t>
       </w:r>
       <w:r>
-        <w:rPr>
-          <w:noProof/>
-        </w:rPr>
         <w:fldChar w:fldCharType="end"/>
       </w:r>
       <w:bookmarkEnd w:id="63"/>
@@ -7665,21 +7610,34 @@
         <w:pStyle w:val="ParagrafoTCC2025"/>
       </w:pPr>
       <w:r>
-        <w:t>A tela mostra um dashboard com tema escuro chamado “</w:t>
+        <w:t xml:space="preserve">A tela mostra um </w:t>
       </w:r>
       <w:proofErr w:type="spellStart"/>
       <w:r>
+        <w:t>dashboard</w:t>
+      </w:r>
+      <w:proofErr w:type="spellEnd"/>
+      <w:r>
+        <w:t xml:space="preserve"> com tema escuro chamado “</w:t>
+      </w:r>
+      <w:proofErr w:type="spellStart"/>
+      <w:r>
         <w:t>Eyesight</w:t>
       </w:r>
       <w:proofErr w:type="spellEnd"/>
       <w:r>
-        <w:t xml:space="preserve">”, onde na lateral esquerda há um menu vertical com opções como Início (selecionado), TikTok, </w:t>
-      </w:r>
-      <w:r>
-        <w:t xml:space="preserve">Instagram, Google </w:t>
+        <w:t xml:space="preserve">”, onde na lateral esquerda há um menu vertical com opções como Início (selecionado), </w:t>
       </w:r>
       <w:proofErr w:type="spellStart"/>
       <w:r>
+        <w:t>TikTok</w:t>
+      </w:r>
+      <w:proofErr w:type="spellEnd"/>
+      <w:r>
+        <w:t xml:space="preserve">, Instagram, Google </w:t>
+      </w:r>
+      <w:proofErr w:type="spellStart"/>
+      <w:r>
         <w:t>Ads</w:t>
       </w:r>
       <w:proofErr w:type="spellEnd"/>
@@ -7711,6 +7669,7 @@
       </w:pPr>
       <w:bookmarkStart w:id="66" w:name="_Toc229427492"/>
       <w:r>
+        <w:lastRenderedPageBreak/>
         <w:t xml:space="preserve">Figura </w:t>
       </w:r>
       <w:r>
@@ -7729,9 +7688,6 @@
         <w:t>24</w:t>
       </w:r>
       <w:r>
-        <w:rPr>
-          <w:noProof/>
-        </w:rPr>
         <w:fldChar w:fldCharType="end"/>
       </w:r>
       <w:r>
@@ -7858,10 +7814,7 @@
         <w:pStyle w:val="ParagrafoTCC2025"/>
       </w:pPr>
       <w:r>
-        <w:t>Essa escolha foi feita pois o novo layout separa melhor a identidade visual do sistema da área de ação, destacando a marca e direcionando o usuário com mais clareza para o login. Isso melhora a experiência, deixa a interface mais moderna e aumenta a percepção de valor do produto. Pois anteriormente, a logo e o formulário estavam alinhados no centro da tela trazendo uma sensação de “aperto”, quando decidimos separar a logo do formulário, pensamos em trazer uma identidade visual bem melhor para a logo e um fo</w:t>
-      </w:r>
-      <w:r>
-        <w:t>co mais restrito somente ao formulário.</w:t>
+        <w:t>Essa escolha foi feita pois o novo layout separa melhor a identidade visual do sistema da área de ação, destacando a marca e direcionando o usuário com mais clareza para o login. Isso melhora a experiência, deixa a interface mais moderna e aumenta a percepção de valor do produto. Pois anteriormente, a logo e o formulário estavam alinhados no centro da tela trazendo uma sensação de “aperto”, quando decidimos separar a logo do formulário, pensamos em trazer uma identidade visual bem melhor para a logo e um foco mais restrito somente ao formulário.</w:t>
       </w:r>
     </w:p>
     <w:p>
@@ -7870,6 +7823,7 @@
       </w:pPr>
       <w:bookmarkStart w:id="67" w:name="_Toc229427522"/>
       <w:r>
+        <w:lastRenderedPageBreak/>
         <w:t>Aula dia 05/05/2026 – Análise da documentação e continuação do desenvolvimento do projeto</w:t>
       </w:r>
       <w:bookmarkEnd w:id="67"/>
@@ -7915,9 +7869,6 @@
         <w:t>25</w:t>
       </w:r>
       <w:r>
-        <w:rPr>
-          <w:noProof/>
-        </w:rPr>
         <w:fldChar w:fldCharType="end"/>
       </w:r>
       <w:r>
@@ -7984,47 +7935,47 @@
       <w:r>
         <w:t xml:space="preserve">Também nesse dia, foi realizado a continuação do </w:t>
       </w:r>
+      <w:r>
+        <w:rPr>
+          <w:i/>
+        </w:rPr>
+        <w:t xml:space="preserve">back-end </w:t>
+      </w:r>
+      <w:r>
+        <w:t xml:space="preserve">e do </w:t>
+      </w:r>
+      <w:r>
+        <w:rPr>
+          <w:i/>
+        </w:rPr>
+        <w:t>front-end</w:t>
+      </w:r>
+      <w:r>
+        <w:t xml:space="preserve"> do projeto, o Gabriel Oliveira ficou encarregado de dar continuação ao desenvolvimento do BD, partindo do ponto que o Felipe </w:t>
+      </w:r>
       <w:proofErr w:type="spellStart"/>
       <w:r>
-        <w:rPr>
-          <w:i/>
-        </w:rPr>
-        <w:t>back-end</w:t>
+        <w:t>Branchini</w:t>
       </w:r>
       <w:proofErr w:type="spellEnd"/>
       <w:r>
-        <w:rPr>
-          <w:i/>
-        </w:rPr>
-        <w:t xml:space="preserve"> </w:t>
-      </w:r>
-      <w:r>
-        <w:t xml:space="preserve">e do </w:t>
-      </w:r>
-      <w:r>
-        <w:rPr>
-          <w:i/>
-        </w:rPr>
-        <w:t>front-</w:t>
+        <w:t xml:space="preserve"> deixou, e tal, nessa aula, encaminhou um e-mail tentando contato com o </w:t>
       </w:r>
       <w:proofErr w:type="spellStart"/>
       <w:r>
-        <w:rPr>
-          <w:i/>
-        </w:rPr>
-        <w:t>end</w:t>
+        <w:t>TikTok</w:t>
       </w:r>
       <w:proofErr w:type="spellEnd"/>
       <w:r>
-        <w:t xml:space="preserve"> do projeto, o Gabriel Oliveira ficou encarregado de dar continuação ao desenvolvimento do BD, partindo do ponto que o Felipe </w:t>
+        <w:t xml:space="preserve"> chinês para a disponibilidade da API do </w:t>
       </w:r>
       <w:proofErr w:type="spellStart"/>
       <w:r>
-        <w:t>Branchini</w:t>
+        <w:t>TikTok</w:t>
       </w:r>
       <w:proofErr w:type="spellEnd"/>
       <w:r>
-        <w:t xml:space="preserve"> deixou, e tal, nessa aula, encaminhou um e-mail tentando contato com o TikTok chinês para a disponibilidade da API do TikTok Shop e a Clara do Vau deu continuidade na tela de login do site.</w:t>
+        <w:t xml:space="preserve"> Shop e a Clara do Vau deu continuidade na tela de login do site.</w:t>
       </w:r>
     </w:p>
     <w:p>
@@ -8033,7 +7984,23 @@
       </w:pPr>
       <w:bookmarkStart w:id="70" w:name="_Toc229427523"/>
       <w:r>
-        <w:t>Aula dia 11/05/2026 – Refatoração da documentação e implementação do prisma pro BD</w:t>
+        <w:t xml:space="preserve">Aula dia 11/05/2026 – </w:t>
+      </w:r>
+      <w:proofErr w:type="spellStart"/>
+      <w:r>
+        <w:t>Refatoração</w:t>
+      </w:r>
+      <w:proofErr w:type="spellEnd"/>
+      <w:r>
+        <w:t xml:space="preserve"> da documentação e implementação do prisma </w:t>
+      </w:r>
+      <w:proofErr w:type="gramStart"/>
+      <w:r>
+        <w:t>pro</w:t>
+      </w:r>
+      <w:proofErr w:type="gramEnd"/>
+      <w:r>
+        <w:t xml:space="preserve"> BD</w:t>
       </w:r>
       <w:bookmarkEnd w:id="70"/>
     </w:p>
@@ -8042,23 +8009,40 @@
         <w:pStyle w:val="ParagrafoTCC2025"/>
       </w:pPr>
       <w:r>
-        <w:t xml:space="preserve">Enquanto isso, o aluno Gabriel Oliveira deu continuidade nas implementações no BD. No dia de hoje, ele conseguiu implementar o prisma para a conexão do BD, isso quer dizer que, o </w:t>
+        <w:t xml:space="preserve">Enquanto isso, o aluno Gabriel Oliveira deu continuidade nas implementações no BD. No dia de hoje, ele conseguiu implementar o prisma para a conexão do BD, isso quer dizer que, o back-end vai ter uma facilidade maior em se conectar com o BD porque o próprio Prisma atua como uma ponte inteligente, ele simplifica drasticamente a forma como é lido o BD, eliminando a necessidade de escrever SQL puro, como é feito nas maiorias dos casos, ao invés de ficar colocando várias </w:t>
       </w:r>
       <w:proofErr w:type="spellStart"/>
       <w:r>
-        <w:t>back-end</w:t>
+        <w:t>query’s</w:t>
       </w:r>
       <w:proofErr w:type="spellEnd"/>
       <w:r>
-        <w:t xml:space="preserve"> vai ter uma facilidade maior em se conectar com o BD porque o próprio Prisma atua como uma ponte inteligente, ele simplifica drasticamente a forma como é lido o BD, eliminando a necessidade de escrever SQL puro, como é feito nas maiorias dos casos, ao invés de ficar colocando várias </w:t>
+        <w:t>(pesquisas) manualmente.</w:t>
+      </w:r>
+    </w:p>
+    <w:p>
+      <w:pPr>
+        <w:pStyle w:val="ParagrafoTCC2025"/>
+      </w:pPr>
+      <w:r>
+        <w:lastRenderedPageBreak/>
+        <w:t xml:space="preserve">Também foi utilizado o </w:t>
       </w:r>
       <w:proofErr w:type="spellStart"/>
       <w:r>
-        <w:t>query’s</w:t>
+        <w:t>Postman</w:t>
       </w:r>
       <w:proofErr w:type="spellEnd"/>
       <w:r>
-        <w:t>(pesquisas) manualmente.</w:t>
+        <w:t xml:space="preserve">, ele é uma plataforma líder e também uma ferramenta de desenvolvimento para construir, testar, documentar e compartilhar </w:t>
+      </w:r>
+      <w:proofErr w:type="spellStart"/>
+      <w:r>
+        <w:t>APIs</w:t>
+      </w:r>
+      <w:proofErr w:type="spellEnd"/>
+      <w:r>
+        <w:t>, no nosso caso, o aluno Gabriel Oliveira utilizou tal somente para realizarmos testes nas API que já conseguimos, ou seja, somente na API do Meta ADS, com todos os testes realizados, conseguimos verificar que a API está funcionando corretamente.</w:t>
       </w:r>
     </w:p>
     <w:p>
@@ -8066,15 +8050,15 @@
         <w:pStyle w:val="ParagrafoTCC2025"/>
       </w:pPr>
       <w:r>
-        <w:t xml:space="preserve">Também foi utilizado o </w:t>
+        <w:t xml:space="preserve">A aluna Clara do Vau também estava desenvolvendo melhorias na nossa tela, abaixo </w:t>
       </w:r>
       <w:proofErr w:type="spellStart"/>
       <w:r>
-        <w:t>Postman</w:t>
+        <w:t>está</w:t>
       </w:r>
       <w:proofErr w:type="spellEnd"/>
       <w:r>
-        <w:t>, ele é uma plataforma líder e também uma ferramenta de desenvolvimento para construir, testar, documentar e compartilhar APIs, no nosso caso, o aluno Gabriel Oliveira utilizou tal somente para realizarmos testes nas API que já conseguimos, ou seja, somente na API do Meta ADS, com todos os testes realizados, conseguimos verificar que a API está funcionando corretamente.</w:t>
+        <w:t xml:space="preserve"> as imagens do antes e depois das melhorias realizadas no dia de hoje, e mais abaixo, está o texto explicativo sobre as mudanças feitas no design e o porquê foram feitas.</w:t>
       </w:r>
     </w:p>
     <w:p>
@@ -8082,22 +8066,6 @@
         <w:pStyle w:val="ParagrafoTCC2025"/>
       </w:pPr>
       <w:r>
-        <w:t xml:space="preserve">A aluna Clara do Vau também estava desenvolvendo melhorias na nossa tela, abaixo </w:t>
-      </w:r>
-      <w:proofErr w:type="spellStart"/>
-      <w:r>
-        <w:t>está</w:t>
-      </w:r>
-      <w:proofErr w:type="spellEnd"/>
-      <w:r>
-        <w:t xml:space="preserve"> as imagens do antes e depois das melhorias realizadas no dia de hoje, e mais abaixo, está o texto explicativo sobre as mudanças feitas no design e o porquê foram feitas.</w:t>
-      </w:r>
-    </w:p>
-    <w:p>
-      <w:pPr>
-        <w:pStyle w:val="ParagrafoTCC2025"/>
-      </w:pPr>
-      <w:r>
         <w:t>Antes:</w:t>
       </w:r>
     </w:p>
@@ -8124,9 +8092,6 @@
         <w:t>26</w:t>
       </w:r>
       <w:r>
-        <w:rPr>
-          <w:noProof/>
-        </w:rPr>
         <w:fldChar w:fldCharType="end"/>
       </w:r>
       <w:r>
@@ -8203,6 +8168,7 @@
         <w:pStyle w:val="Legenda"/>
       </w:pPr>
       <w:r>
+        <w:lastRenderedPageBreak/>
         <w:t xml:space="preserve">Figura </w:t>
       </w:r>
       <w:r>
@@ -8221,9 +8187,6 @@
         <w:t>27</w:t>
       </w:r>
       <w:r>
-        <w:rPr>
-          <w:noProof/>
-        </w:rPr>
         <w:fldChar w:fldCharType="end"/>
       </w:r>
       <w:r>
@@ -8284,10 +8247,7 @@
         <w:pStyle w:val="FonteTCC2025"/>
       </w:pPr>
       <w:r>
-        <w:t xml:space="preserve">Fonte: </w:t>
-      </w:r>
-      <w:r>
-        <w:t>Print tirada por Clara do Vau</w:t>
+        <w:t>Fonte: Print tirada por Clara do Vau</w:t>
       </w:r>
     </w:p>
     <w:p>
@@ -8359,6 +8319,7 @@
         <w:pStyle w:val="ParagrafoTCC2025"/>
       </w:pPr>
       <w:r>
+        <w:lastRenderedPageBreak/>
         <w:t xml:space="preserve">Também, logo após a conversa, o aluno Enrico </w:t>
       </w:r>
       <w:proofErr w:type="spellStart"/>
@@ -8418,28 +8379,279 @@
         <w:pStyle w:val="Ttulo1"/>
       </w:pPr>
       <w:r>
-        <w:t xml:space="preserve">Aula dia 19/05/2026 – Conversa com o professor e conexão do </w:t>
+        <w:t>Aula dia 19/05/2026 – Conversa com o professor e conexão do back-end com o front-end</w:t>
+      </w:r>
+    </w:p>
+    <w:p>
+      <w:pPr>
+        <w:pStyle w:val="ParagrafoTCC2025"/>
+      </w:pPr>
+      <w:r>
+        <w:t>Nessa aula, os alunos analisaram mais alguns pontos cruciais dentro do software até o momento em que o professor Emerson pediu para os responsáveis pela programação conversar com ele, ele pediu para “agilizarmos” o projeto e nos deu instruções sobre como prosseguirmos.</w:t>
+      </w:r>
+    </w:p>
+    <w:p>
+      <w:pPr>
+        <w:pStyle w:val="ParagrafoTCC2025"/>
+      </w:pPr>
+      <w:r>
+        <w:t xml:space="preserve">Enquanto, os programadores estavam conversando com o professor, o Enrico </w:t>
       </w:r>
       <w:proofErr w:type="spellStart"/>
       <w:r>
-        <w:t>back-end</w:t>
+        <w:t>Fedel</w:t>
       </w:r>
       <w:proofErr w:type="spellEnd"/>
       <w:r>
-        <w:t xml:space="preserve"> com o front-</w:t>
+        <w:t xml:space="preserve"> estava arrumando as pendências que o professor havia pedido nas aulas anteriores, pendências que não foram realizadas no período pedido, e o Davi Scavassa estava estudando como criar um repositório no GitHub para melhorar nossa administração do projeto, para não depender de Pen-drive ou envio de arquivos por meio de redes sociais, como o Discord e o Whatsapp.</w:t>
+      </w:r>
+    </w:p>
+    <w:p>
+      <w:pPr>
+        <w:pStyle w:val="ParagrafoTCC2025"/>
+      </w:pPr>
+      <w:r>
+        <w:t>Também, logo após a conversa, o Gabriel Oliveira tentou realizar a conexão do front-end com o back-end, como aconselhado pelo professor, mas não obteve sucesso. Porém, fora do horário de aula, o mesmo conseguiu realizar essa tarefa, alcançando êxito e deixando o front e o back</w:t>
+      </w:r>
+      <w:bookmarkStart w:id="71" w:name="_GoBack"/>
+      <w:bookmarkEnd w:id="71"/>
+      <w:r>
+        <w:t xml:space="preserve"> conectados.</w:t>
+      </w:r>
+    </w:p>
+    <w:p>
+      <w:pPr>
+        <w:pStyle w:val="Ttulo1"/>
+        <w:rPr>
+          <w:lang w:bidi="pt-BR"/>
+        </w:rPr>
+      </w:pPr>
+      <w:r>
+        <w:rPr>
+          <w:lang w:bidi="pt-BR"/>
+        </w:rPr>
+        <w:t>Dia 21/03/2026 - Migração do nosso BD para um servidor flexível MySQL</w:t>
+      </w:r>
+    </w:p>
+    <w:p>
+      <w:pPr>
+        <w:pStyle w:val="ParagrafoTCC2025"/>
+        <w:rPr>
+          <w:lang w:bidi="pt-BR"/>
+        </w:rPr>
+      </w:pPr>
+      <w:r>
+        <w:rPr>
+          <w:lang w:bidi="pt-BR"/>
+        </w:rPr>
+        <w:t xml:space="preserve">Nesse dia, </w:t>
+      </w:r>
+      <w:r>
+        <w:rPr>
+          <w:lang w:bidi="pt-BR"/>
+        </w:rPr>
+        <w:t>o aluno Gabriel Oliveira junto com o Davi Scavassa realizou</w:t>
+      </w:r>
+      <w:r>
+        <w:rPr>
+          <w:lang w:bidi="pt-BR"/>
+        </w:rPr>
+        <w:t xml:space="preserve"> a migração do BD, atualmente, "hospedado" no RAILWAY, para um servidor flexível MySQL disponibilizado pela Azure, um serviço da Microsoft.</w:t>
+      </w:r>
+    </w:p>
+    <w:p>
+      <w:pPr>
+        <w:pStyle w:val="ParagrafoTCC2025"/>
+        <w:rPr>
+          <w:lang w:bidi="pt-BR"/>
+        </w:rPr>
+      </w:pPr>
+      <w:r>
+        <w:rPr>
+          <w:lang w:bidi="pt-BR"/>
+        </w:rPr>
+        <w:t xml:space="preserve">Porém, foi descoberto um problema, que consistia em que todos os alunos. </w:t>
+      </w:r>
+      <w:r>
+        <w:rPr>
+          <w:lang w:bidi="pt-BR"/>
+        </w:rPr>
+        <w:t>Exceto</w:t>
+      </w:r>
+      <w:r>
+        <w:rPr>
+          <w:lang w:bidi="pt-BR"/>
+        </w:rPr>
+        <w:t xml:space="preserve"> o Gabriel Oliveira, não tinham acesso ao BD, com isso, o aluno Davi Scavassa começou a estudar o funcionamento desse servidor, porém no dia n</w:t>
+      </w:r>
+      <w:r>
+        <w:rPr>
+          <w:lang w:bidi="pt-BR"/>
+        </w:rPr>
+        <w:t>ão</w:t>
+      </w:r>
+      <w:r>
+        <w:rPr>
+          <w:lang w:bidi="pt-BR"/>
+        </w:rPr>
+        <w:t xml:space="preserve"> houve êxito nessa tarefa.</w:t>
+      </w:r>
+    </w:p>
+    <w:p>
+      <w:pPr>
+        <w:pStyle w:val="Ttulo1"/>
+        <w:rPr>
+          <w:lang w:bidi="pt-BR"/>
+        </w:rPr>
+      </w:pPr>
+      <w:r>
+        <w:rPr>
+          <w:lang w:bidi="pt-BR"/>
+        </w:rPr>
+        <w:t>Dia 23/05/2026 - Permissão para os demais integrantes</w:t>
+      </w:r>
+    </w:p>
+    <w:p>
+      <w:pPr>
+        <w:pStyle w:val="ParagrafoTCC2025"/>
+        <w:rPr>
+          <w:lang w:bidi="pt-BR"/>
+        </w:rPr>
+      </w:pPr>
+      <w:r>
+        <w:rPr>
+          <w:lang w:bidi="pt-BR"/>
+        </w:rPr>
+        <w:t>Na madrugada desse dia, o aluno Davi Scavassa, realizou alguns testes e acabou descobrindo a melhor maneira de como integrar os demais desenvolvedores a esse BD. Até o presente momento, somente os alunos Davi Scavassa e Gabriel Oliveira obtiveram acesso a esse servidor, pois estamos na espera das informações dos demais desenvolvedores para a integração dos mesmos ao servidor.</w:t>
+      </w:r>
+    </w:p>
+    <w:p>
+      <w:pPr>
+        <w:pStyle w:val="Ttulo1"/>
+      </w:pPr>
+      <w:r>
+        <w:lastRenderedPageBreak/>
+        <w:t xml:space="preserve">Aula dia 25/05/2026 – </w:t>
+      </w:r>
+      <w:r>
+        <w:t>Integração do front-end com o back-end</w:t>
+      </w:r>
+    </w:p>
+    <w:p>
+      <w:pPr>
+        <w:pStyle w:val="ParagrafoTCC2025"/>
+      </w:pPr>
+      <w:r>
+        <w:t>Nessa aula, o Gabriel Oliveira em conjunto com a Clara do Vau realizou a integração do front-end com o back-end, ou seja, ligou as telas à parte lógica do software, com isso, já é possível realizar o cadastro, e-mail e senha ficam armazenadas no BD, e consequentemente, o login, que faz uma query no BD e analisa se o usuário existe.</w:t>
+      </w:r>
+    </w:p>
+    <w:p>
+      <w:pPr>
+        <w:pStyle w:val="Ttulo1"/>
+      </w:pPr>
+      <w:r>
+        <w:t xml:space="preserve">Aula dia 26/05/2026 – </w:t>
+      </w:r>
+      <w:r>
+        <w:t>Análise e discussão com o professor</w:t>
+      </w:r>
+    </w:p>
+    <w:p>
+      <w:pPr>
+        <w:pStyle w:val="ParagrafoTCC2025"/>
+      </w:pPr>
+      <w:r>
+        <w:t xml:space="preserve">Nesse dia, o professor Emerson realizou a análise do andamento do projeto na primeira parte da aula, após o intervalo, tal chamou os membros do grupo que estavam presentes para discutir pontos que estavam fazendo o grupo ter um desempenho negativo, após a análise do software, da Documentação e Diário de Bordo, foi nos enviado o e-mail que está ilustrado na </w:t>
+      </w:r>
+      <w:r>
+        <w:fldChar w:fldCharType="begin"/>
+      </w:r>
+      <w:r>
+        <w:instrText xml:space="preserve"> REF _Ref231284773 \h </w:instrText>
+      </w:r>
+      <w:r>
+        <w:instrText xml:space="preserve"> \* MERGEFORMAT </w:instrText>
+      </w:r>
+      <w:r>
+        <w:fldChar w:fldCharType="separate"/>
+      </w:r>
+      <w:r>
+        <w:t>Figur</w:t>
+      </w:r>
+      <w:r>
+        <w:t>a</w:t>
+      </w:r>
+      <w:r>
+        <w:t xml:space="preserve"> </w:t>
+      </w:r>
+      <w:r>
+        <w:rPr>
+          <w:noProof/>
+        </w:rPr>
+        <w:t>28</w:t>
+      </w:r>
+      <w:r>
+        <w:t xml:space="preserve"> </w:t>
+      </w:r>
+      <w:r>
+        <w:fldChar w:fldCharType="end"/>
+      </w:r>
+      <w:r>
+        <w:t>.</w:t>
+      </w:r>
+    </w:p>
+    <w:p>
+      <w:pPr>
+        <w:pStyle w:val="Ttulo1"/>
+      </w:pPr>
+      <w:r>
+        <w:t>Dia 30/05/2026 – Organização do repositório no GitHub</w:t>
+      </w:r>
+    </w:p>
+    <w:p>
+      <w:pPr>
+        <w:pStyle w:val="ParagrafoTCC2025"/>
+      </w:pPr>
+      <w:r>
+        <w:t>Na madrugada desse dia, o Davi Scavassa realizou o upload dos arquivos faltantes para o repositório no GitHub</w:t>
+      </w:r>
+      <w:r>
+        <w:t>, estavam faltantes a Documentação e o Diário de Bordo, também foram realizadas as integrações dos membros do grupo que ainda não tinham acesso ao servidor flexível do Azure.</w:t>
+      </w:r>
+    </w:p>
+    <w:p>
+      <w:pPr>
+        <w:pStyle w:val="Ttulo1"/>
+      </w:pPr>
+      <w:r>
+        <w:t xml:space="preserve">Aula dia 01/06/2026 – Criação da </w:t>
       </w:r>
       <w:proofErr w:type="spellStart"/>
       <w:r>
-        <w:t>end</w:t>
+        <w:t>Landing</w:t>
       </w:r>
       <w:proofErr w:type="spellEnd"/>
+      <w:r>
+        <w:t xml:space="preserve"> Page</w:t>
+      </w:r>
     </w:p>
     <w:p>
       <w:pPr>
         <w:pStyle w:val="ParagrafoTCC2025"/>
       </w:pPr>
       <w:r>
-        <w:t>Nessa aula, os alunos analisaram mais alguns pontos cruciais dentro do software até o momento em que o professor Emerson pediu para os responsáveis pela programação conversar com ele, ele pediu para “agilizarmos” o projeto e nos deu instruções sobre como prosseguirmos.</w:t>
+        <w:t xml:space="preserve">Nessa aula, a Clara do Vau juntamente com o Gabriel Oliveira criou a </w:t>
+      </w:r>
+      <w:proofErr w:type="spellStart"/>
+      <w:r>
+        <w:t>Land</w:t>
+      </w:r>
+      <w:r>
+        <w:t>ing</w:t>
+      </w:r>
+      <w:proofErr w:type="spellEnd"/>
+      <w:r>
+        <w:t xml:space="preserve"> Page, página que antecede a tela de cadastro, ou seja, vai ser a tela em que o usuário vai acessar ao clicar no link do site.</w:t>
       </w:r>
     </w:p>
     <w:p>
@@ -8447,7 +8659,7 @@
         <w:pStyle w:val="ParagrafoTCC2025"/>
       </w:pPr>
       <w:r>
-        <w:t xml:space="preserve">Enquanto, os programadores estavam conversando com o professor, o Enrico </w:t>
+        <w:t xml:space="preserve">Também, o Enrico </w:t>
       </w:r>
       <w:proofErr w:type="spellStart"/>
       <w:r>
@@ -8455,148 +8667,114 @@
       </w:r>
       <w:proofErr w:type="spellEnd"/>
       <w:r>
-        <w:t xml:space="preserve"> estava arrumando as pendências que o professor havia pedido nas aulas anteriores, pendências que não foram realizadas no período pedido, e o Davi Scavassa estava estudando como criar um repositório no GitHub para melhorar nossa administração do projeto, para não depender de Pen-drive ou envio de arquivos por meio de redes sociais, como o </w:t>
+        <w:t xml:space="preserve"> realizou uma análise e reescrita da documentação seguindo as orientações do professor Emerson enviadas por e-mail a todos os integrantes do grupo conforme mostrado na imagem abaixo:</w:t>
+      </w:r>
+    </w:p>
+    <w:p>
+      <w:pPr>
+        <w:pStyle w:val="Legenda"/>
+      </w:pPr>
+      <w:bookmarkStart w:id="72" w:name="_Ref231284773"/>
+      <w:r>
+        <w:lastRenderedPageBreak/>
+        <w:t xml:space="preserve">Figura </w:t>
+      </w:r>
+      <w:r>
+        <w:fldChar w:fldCharType="begin"/>
+      </w:r>
+      <w:r>
+        <w:instrText xml:space="preserve"> SEQ Figura \* ARABIC </w:instrText>
+      </w:r>
+      <w:r>
+        <w:fldChar w:fldCharType="separate"/>
+      </w:r>
+      <w:r>
+        <w:rPr>
+          <w:noProof/>
+        </w:rPr>
+        <w:t>28</w:t>
+      </w:r>
+      <w:r>
+        <w:fldChar w:fldCharType="end"/>
+      </w:r>
+      <w:r>
+        <w:t xml:space="preserve"> - E-mail enviado pelo professor contendo instruções</w:t>
+      </w:r>
+      <w:bookmarkEnd w:id="72"/>
+    </w:p>
+    <w:p>
+      <w:r>
+        <w:drawing>
+          <wp:inline distT="0" distB="0" distL="0" distR="0" wp14:anchorId="6BB66EC8" wp14:editId="58F77716">
+            <wp:extent cx="5836285" cy="2219960"/>
+            <wp:effectExtent l="0" t="0" r="0" b="8890"/>
+            <wp:docPr id="29" name="Imagem 29"/>
+            <wp:cNvGraphicFramePr>
+              <a:graphicFrameLocks xmlns:a="http://schemas.openxmlformats.org/drawingml/2006/main" noChangeAspect="1"/>
+            </wp:cNvGraphicFramePr>
+            <a:graphic xmlns:a="http://schemas.openxmlformats.org/drawingml/2006/main">
+              <a:graphicData uri="http://schemas.openxmlformats.org/drawingml/2006/picture">
+                <pic:pic xmlns:pic="http://schemas.openxmlformats.org/drawingml/2006/picture">
+                  <pic:nvPicPr>
+                    <pic:cNvPr id="1" name=""/>
+                    <pic:cNvPicPr/>
+                  </pic:nvPicPr>
+                  <pic:blipFill>
+                    <a:blip r:embed="rId35"/>
+                    <a:stretch>
+                      <a:fillRect/>
+                    </a:stretch>
+                  </pic:blipFill>
+                  <pic:spPr>
+                    <a:xfrm>
+                      <a:off x="0" y="0"/>
+                      <a:ext cx="5836285" cy="2219960"/>
+                    </a:xfrm>
+                    <a:prstGeom prst="rect">
+                      <a:avLst/>
+                    </a:prstGeom>
+                  </pic:spPr>
+                </pic:pic>
+              </a:graphicData>
+            </a:graphic>
+          </wp:inline>
+        </w:drawing>
+      </w:r>
+    </w:p>
+    <w:p>
+      <w:pPr>
+        <w:pStyle w:val="FonteTCC2025"/>
+      </w:pPr>
+      <w:r>
+        <w:t>Fonte: Print tirado por Davi Scavassa</w:t>
+      </w:r>
+    </w:p>
+    <w:p>
+      <w:pPr>
+        <w:pStyle w:val="ParagrafoTCC2025"/>
+      </w:pPr>
+      <w:r>
+        <w:t xml:space="preserve">O aluno Felipe </w:t>
       </w:r>
       <w:proofErr w:type="spellStart"/>
       <w:r>
-        <w:t>Discord</w:t>
+        <w:t>Branchini</w:t>
       </w:r>
       <w:proofErr w:type="spellEnd"/>
       <w:r>
-        <w:t xml:space="preserve"> e o </w:t>
-      </w:r>
-      <w:proofErr w:type="spellStart"/>
-      <w:r>
-        <w:t>Whatsapp</w:t>
-      </w:r>
-      <w:proofErr w:type="spellEnd"/>
-      <w:r>
-        <w:t>.</w:t>
-      </w:r>
-    </w:p>
-    <w:p>
-      <w:pPr>
-        <w:pStyle w:val="ParagrafoTCC2025"/>
-      </w:pPr>
-      <w:r>
-        <w:t>Também, logo após a conversa, o Gabriel Oliveira tentou realizar a conexão do front-</w:t>
-      </w:r>
-      <w:proofErr w:type="spellStart"/>
-      <w:r>
-        <w:t>end</w:t>
-      </w:r>
-      <w:proofErr w:type="spellEnd"/>
-      <w:r>
-        <w:t xml:space="preserve"> com o </w:t>
-      </w:r>
-      <w:proofErr w:type="spellStart"/>
-      <w:r>
-        <w:t>back-end</w:t>
-      </w:r>
-      <w:proofErr w:type="spellEnd"/>
-      <w:r>
-        <w:t xml:space="preserve">, como aconselhado pelo professor, mas não obteve sucesso. Porém, fora do horário de aula, o mesmo conseguiu realizar essa tarefa, alcançando êxito e deixando o front e o </w:t>
-      </w:r>
-      <w:proofErr w:type="spellStart"/>
-      <w:r>
-        <w:t>back</w:t>
-      </w:r>
-      <w:proofErr w:type="spellEnd"/>
-      <w:r>
-        <w:t xml:space="preserve"> conectados.</w:t>
+        <w:t xml:space="preserve"> realizou também uma reestruturação do BD, pois do jeito que estava, acabaria acarretando vários problemas ao sistema, portanto foi criada novas tabelas e novas sessões para melhor experiência do usuário.</w:t>
       </w:r>
     </w:p>
     <w:p>
       <w:pPr>
         <w:pStyle w:val="Ttulo1"/>
-        <w:rPr>
-          <w:lang w:bidi="pt-BR"/>
-        </w:rPr>
-      </w:pPr>
-      <w:r>
-        <w:rPr>
-          <w:lang w:bidi="pt-BR"/>
-        </w:rPr>
-        <w:t>Dia 21/03/2026 - Migração do nosso BD para um servidor flexível MySQL</w:t>
-      </w:r>
-    </w:p>
-    <w:p>
-      <w:pPr>
-        <w:pStyle w:val="ParagrafoTCC2025"/>
-        <w:rPr>
-          <w:lang w:bidi="pt-BR"/>
-        </w:rPr>
-      </w:pPr>
-      <w:r>
-        <w:rPr>
-          <w:lang w:bidi="pt-BR"/>
-        </w:rPr>
-        <w:t xml:space="preserve">Nesse dia, </w:t>
-      </w:r>
-      <w:r>
-        <w:rPr>
-          <w:lang w:bidi="pt-BR"/>
-        </w:rPr>
-        <w:t>o aluno Gabriel Oliveira junto com o Davi Scavassa realizou</w:t>
-      </w:r>
-      <w:r>
-        <w:rPr>
-          <w:lang w:bidi="pt-BR"/>
-        </w:rPr>
-        <w:t xml:space="preserve"> a migração do BD, atualmente, "hospedado" no RAILWAY, para um servidor flexível MySQL disponibilizado pela Azure, um serviço da Microsoft.</w:t>
-      </w:r>
-    </w:p>
-    <w:p>
-      <w:pPr>
-        <w:pStyle w:val="ParagrafoTCC2025"/>
-        <w:rPr>
-          <w:lang w:bidi="pt-BR"/>
-        </w:rPr>
-      </w:pPr>
-      <w:r>
-        <w:rPr>
-          <w:lang w:bidi="pt-BR"/>
-        </w:rPr>
-        <w:t>Porém, foi descoberto um problema, que consistia em que todos os alunos. exceto o Gabriel Oliveira, não tinham acesso ao BD, com isso, o aluno Davi Scavassa começou a estudar o funcionamento desse servidor, porém no dia n</w:t>
-      </w:r>
-      <w:r>
-        <w:rPr>
-          <w:lang w:bidi="pt-BR"/>
-        </w:rPr>
-        <w:t>ão</w:t>
-      </w:r>
-      <w:r>
-        <w:rPr>
-          <w:lang w:bidi="pt-BR"/>
-        </w:rPr>
-        <w:t xml:space="preserve"> houve êxito nessa tarefa.</w:t>
-      </w:r>
-    </w:p>
-    <w:p>
-      <w:pPr>
-        <w:pStyle w:val="Ttulo1"/>
-        <w:rPr>
-          <w:lang w:bidi="pt-BR"/>
-        </w:rPr>
-      </w:pPr>
-      <w:r>
-        <w:rPr>
-          <w:lang w:bidi="pt-BR"/>
-        </w:rPr>
-        <w:t>Dia 23/05/2026 - Permissão para os demais integrantes</w:t>
-      </w:r>
-    </w:p>
-    <w:p>
-      <w:pPr>
-        <w:pStyle w:val="ParagrafoTCC2025"/>
-      </w:pPr>
-      <w:r>
-        <w:rPr>
-          <w:lang w:bidi="pt-BR"/>
-        </w:rPr>
-        <w:t>Na madrugada desse dia, o aluno Davi Scavassa, realizou alguns testes e acabou descobrindo a melhor maneira de como integrar os demais desenvolvedores a esse BD. Até o presente momento, somente os alunos Davi Scavassa e Gabriel Oliveira obtiveram acesso a esse servidor, pois estamos na espera das informações dos demais desenvolvedores para a integração dos mesmos ao servidor.</w:t>
-      </w:r>
-    </w:p>
+      </w:pPr>
+      <w:r>
+        <w:t>Aula dia 02/06/2026 – Teste da integração da API do Meta</w:t>
+      </w:r>
+    </w:p>
+    <w:p/>
+    <w:p/>
     <w:p>
       <w:pPr>
         <w:spacing w:after="160" w:line="259" w:lineRule="auto"/>
@@ -8611,6 +8789,12 @@
           <w:b/>
         </w:rPr>
         <w:br w:type="page"/>
+      </w:r>
+      <w:r>
+        <w:rPr>
+          <w:b/>
+        </w:rPr>
+        <w:lastRenderedPageBreak/>
         <w:t>REFERÊNCIAS</w:t>
       </w:r>
     </w:p>
@@ -8636,7 +8820,7 @@
       <w:r>
         <w:t xml:space="preserve"> – Ferramenta colaborativa de design de interfaces. Disponível em: </w:t>
       </w:r>
-      <w:hyperlink r:id="rId35">
+      <w:hyperlink r:id="rId36">
         <w:r>
           <w:rPr>
             <w:rStyle w:val="Hyperlink"/>
@@ -8660,9 +8844,17 @@
         <w:t>MICROSOFT.</w:t>
       </w:r>
       <w:r>
-        <w:t xml:space="preserve"> Microsoft Teams – Plataforma de colaboração. Disponível em: </w:t>
-      </w:r>
-      <w:hyperlink r:id="rId36">
+        <w:t xml:space="preserve"> Microsoft </w:t>
+      </w:r>
+      <w:proofErr w:type="spellStart"/>
+      <w:r>
+        <w:t>Teams</w:t>
+      </w:r>
+      <w:proofErr w:type="spellEnd"/>
+      <w:r>
+        <w:t xml:space="preserve"> – Plataforma de colaboração. Disponível em: </w:t>
+      </w:r>
+      <w:hyperlink r:id="rId37">
         <w:r>
           <w:rPr>
             <w:rStyle w:val="Hyperlink"/>
@@ -8704,7 +8896,7 @@
       <w:r>
         <w:t xml:space="preserve">. Disponível em: </w:t>
       </w:r>
-      <w:hyperlink r:id="rId37">
+      <w:hyperlink r:id="rId38">
         <w:r>
           <w:rPr>
             <w:rStyle w:val="Hyperlink"/>
@@ -8738,7 +8930,7 @@
       <w:r>
         <w:t xml:space="preserve"> – Plataforma de criação visual. Disponível em: </w:t>
       </w:r>
-      <w:hyperlink r:id="rId38">
+      <w:hyperlink r:id="rId39">
         <w:r>
           <w:rPr>
             <w:rStyle w:val="Hyperlink"/>
@@ -8764,7 +8956,7 @@
       <w:r>
         <w:t xml:space="preserve"> GitHub – Hospedagem de código e controle de versão. Disponível em: </w:t>
       </w:r>
-      <w:hyperlink r:id="rId39">
+      <w:hyperlink r:id="rId40">
         <w:r>
           <w:rPr>
             <w:rStyle w:val="Hyperlink"/>
@@ -8798,7 +8990,7 @@
       <w:r>
         <w:t xml:space="preserve"> – Sistema de controle de versão distribuído. Disponível em: </w:t>
       </w:r>
-      <w:hyperlink r:id="rId40">
+      <w:hyperlink r:id="rId41">
         <w:r>
           <w:rPr>
             <w:rStyle w:val="Hyperlink"/>
@@ -8832,7 +9024,7 @@
       <w:r>
         <w:t xml:space="preserve"> – Ícones Vetoriais. Disponível em: </w:t>
       </w:r>
-      <w:hyperlink r:id="rId41">
+      <w:hyperlink r:id="rId42">
         <w:r>
           <w:rPr>
             <w:rStyle w:val="Hyperlink"/>
@@ -8866,7 +9058,7 @@
       <w:r>
         <w:t xml:space="preserve"> – Ícones e vetores. Disponível em: </w:t>
       </w:r>
-      <w:hyperlink r:id="rId42">
+      <w:hyperlink r:id="rId43">
         <w:r>
           <w:rPr>
             <w:rStyle w:val="Hyperlink"/>
@@ -8900,7 +9092,7 @@
       <w:r>
         <w:t xml:space="preserve"> – Editor de imagens online. Disponível em: </w:t>
       </w:r>
-      <w:hyperlink r:id="rId43">
+      <w:hyperlink r:id="rId44">
         <w:r>
           <w:rPr>
             <w:rStyle w:val="Hyperlink"/>
@@ -8934,7 +9126,7 @@
       <w:r>
         <w:t xml:space="preserve"> Web – Ferramenta de modelagem de banco de dados. Disponível em: </w:t>
       </w:r>
-      <w:hyperlink r:id="rId44">
+      <w:hyperlink r:id="rId45">
         <w:r>
           <w:rPr>
             <w:rStyle w:val="Hyperlink"/>
@@ -8968,7 +9160,7 @@
       <w:r>
         <w:t xml:space="preserve"> – Framework PHP para desenvolvimento web. Disponível em: </w:t>
       </w:r>
-      <w:hyperlink r:id="rId45">
+      <w:hyperlink r:id="rId46">
         <w:r>
           <w:rPr>
             <w:rStyle w:val="Hyperlink"/>
@@ -9010,7 +9202,7 @@
       <w:r>
         <w:t xml:space="preserve"> e mensagens em tempo real. Disponível em: </w:t>
       </w:r>
-      <w:hyperlink r:id="rId46">
+      <w:hyperlink r:id="rId47">
         <w:r>
           <w:rPr>
             <w:rStyle w:val="Hyperlink"/>
@@ -9036,7 +9228,7 @@
       <w:r>
         <w:t xml:space="preserve"> Gemini – Ferramenta de IA para textos e análises. Disponível em: </w:t>
       </w:r>
-      <w:hyperlink r:id="rId47">
+      <w:hyperlink r:id="rId48">
         <w:r>
           <w:rPr>
             <w:rStyle w:val="Hyperlink"/>
@@ -9049,9 +9241,9 @@
       </w:r>
     </w:p>
     <w:sectPr>
-      <w:headerReference w:type="even" r:id="rId48"/>
-      <w:headerReference w:type="default" r:id="rId49"/>
-      <w:headerReference w:type="first" r:id="rId50"/>
+      <w:headerReference w:type="even" r:id="rId49"/>
+      <w:headerReference w:type="default" r:id="rId50"/>
+      <w:headerReference w:type="first" r:id="rId51"/>
       <w:pgSz w:w="11906" w:h="16838"/>
       <w:pgMar w:top="1704" w:right="1013" w:bottom="1141" w:left="1702" w:header="720" w:footer="720" w:gutter="0"/>
       <w:cols w:space="720"/>
@@ -9061,7 +9253,7 @@
 </file>
 
 <file path=word/endnotes.xml><?xml version="1.0" encoding="utf-8"?>
-<w:endnotes xmlns:wpc="http://schemas.microsoft.com/office/word/2010/wordprocessingCanvas" xmlns:cx="http://schemas.microsoft.com/office/drawing/2014/chartex" xmlns:cx1="http://schemas.microsoft.com/office/drawing/2015/9/8/chartex" xmlns:cx2="http://schemas.microsoft.com/office/drawing/2015/10/21/chartex" xmlns:cx3="http://schemas.microsoft.com/office/drawing/2016/5/9/chartex" xmlns:cx4="http://schemas.microsoft.com/office/drawing/2016/5/10/chartex" xmlns:cx5="http://schemas.microsoft.com/office/drawing/2016/5/11/chartex" xmlns:cx6="http://schemas.microsoft.com/office/drawing/2016/5/12/chartex" xmlns:cx7="http://schemas.microsoft.com/office/drawing/2016/5/13/chartex" xmlns:cx8="http://schemas.microsoft.com/office/drawing/2016/5/14/chartex" xmlns:mc="http://schemas.openxmlformats.org/markup-compatibility/2006" xmlns:aink="http://schemas.microsoft.com/office/drawing/2016/ink" xmlns:am3d="http://schemas.microsoft.com/office/drawing/2017/model3d" xmlns:o="urn:schemas-microsoft-com:office:office" xmlns:oel="http://schemas.microsoft.com/office/2019/extlst" xmlns:r="http://schemas.openxmlformats.org/officeDocument/2006/relationships" xmlns:m="http://schemas.openxmlformats.org/officeDocument/2006/math" xmlns:v="urn:schemas-microsoft-com:vml" xmlns:wp14="http://schemas.microsoft.com/office/word/2010/wordprocessingDrawing" xmlns:wp="http://schemas.openxmlformats.org/drawingml/2006/wordprocessingDrawing" xmlns:w10="urn:schemas-microsoft-com:office:word" xmlns:w="http://schemas.openxmlformats.org/wordprocessingml/2006/main" xmlns:w14="http://schemas.microsoft.com/office/word/2010/wordml" xmlns:w15="http://schemas.microsoft.com/office/word/2012/wordml" xmlns:w16cex="http://schemas.microsoft.com/office/word/2018/wordml/cex" xmlns:w16cid="http://schemas.microsoft.com/office/word/2016/wordml/cid" xmlns:w16="http://schemas.microsoft.com/office/word/2018/wordml" xmlns:w16sdtdh="http://schemas.microsoft.com/office/word/2020/wordml/sdtdatahash" xmlns:w16se="http://schemas.microsoft.com/office/word/2015/wordml/symex" xmlns:wpg="http://schemas.microsoft.com/office/word/2010/wordprocessingGroup" xmlns:wpi="http://schemas.microsoft.com/office/word/2010/wordprocessingInk" xmlns:wne="http://schemas.microsoft.com/office/word/2006/wordml" xmlns:wps="http://schemas.microsoft.com/office/word/2010/wordprocessingShape" mc:Ignorable="w14 w15 w16se w16cid w16 w16cex w16sdtdh wp14">
+<w:endnotes xmlns:wpc="http://schemas.microsoft.com/office/word/2010/wordprocessingCanvas" xmlns:cx="http://schemas.microsoft.com/office/drawing/2014/chartex" xmlns:mc="http://schemas.openxmlformats.org/markup-compatibility/2006" xmlns:o="urn:schemas-microsoft-com:office:office" xmlns:r="http://schemas.openxmlformats.org/officeDocument/2006/relationships" xmlns:m="http://schemas.openxmlformats.org/officeDocument/2006/math" xmlns:v="urn:schemas-microsoft-com:vml" xmlns:wp14="http://schemas.microsoft.com/office/word/2010/wordprocessingDrawing" xmlns:wp="http://schemas.openxmlformats.org/drawingml/2006/wordprocessingDrawing" xmlns:w10="urn:schemas-microsoft-com:office:word" xmlns:w="http://schemas.openxmlformats.org/wordprocessingml/2006/main" xmlns:w14="http://schemas.microsoft.com/office/word/2010/wordml" xmlns:w15="http://schemas.microsoft.com/office/word/2012/wordml" xmlns:w16se="http://schemas.microsoft.com/office/word/2015/wordml/symex" xmlns:wpg="http://schemas.microsoft.com/office/word/2010/wordprocessingGroup" xmlns:wpi="http://schemas.microsoft.com/office/word/2010/wordprocessingInk" xmlns:wne="http://schemas.microsoft.com/office/word/2006/wordml" xmlns:wps="http://schemas.microsoft.com/office/word/2010/wordprocessingShape" mc:Ignorable="w14 w15 w16se wp14">
   <w:endnote w:type="separator" w:id="-1">
     <w:p>
       <w:pPr>
@@ -9086,7 +9278,7 @@
 </file>
 
 <file path=word/footnotes.xml><?xml version="1.0" encoding="utf-8"?>
-<w:footnotes xmlns:wpc="http://schemas.microsoft.com/office/word/2010/wordprocessingCanvas" xmlns:cx="http://schemas.microsoft.com/office/drawing/2014/chartex" xmlns:cx1="http://schemas.microsoft.com/office/drawing/2015/9/8/chartex" xmlns:cx2="http://schemas.microsoft.com/office/drawing/2015/10/21/chartex" xmlns:cx3="http://schemas.microsoft.com/office/drawing/2016/5/9/chartex" xmlns:cx4="http://schemas.microsoft.com/office/drawing/2016/5/10/chartex" xmlns:cx5="http://schemas.microsoft.com/office/drawing/2016/5/11/chartex" xmlns:cx6="http://schemas.microsoft.com/office/drawing/2016/5/12/chartex" xmlns:cx7="http://schemas.microsoft.com/office/drawing/2016/5/13/chartex" xmlns:cx8="http://schemas.microsoft.com/office/drawing/2016/5/14/chartex" xmlns:mc="http://schemas.openxmlformats.org/markup-compatibility/2006" xmlns:aink="http://schemas.microsoft.com/office/drawing/2016/ink" xmlns:am3d="http://schemas.microsoft.com/office/drawing/2017/model3d" xmlns:o="urn:schemas-microsoft-com:office:office" xmlns:oel="http://schemas.microsoft.com/office/2019/extlst" xmlns:r="http://schemas.openxmlformats.org/officeDocument/2006/relationships" xmlns:m="http://schemas.openxmlformats.org/officeDocument/2006/math" xmlns:v="urn:schemas-microsoft-com:vml" xmlns:wp14="http://schemas.microsoft.com/office/word/2010/wordprocessingDrawing" xmlns:wp="http://schemas.openxmlformats.org/drawingml/2006/wordprocessingDrawing" xmlns:w10="urn:schemas-microsoft-com:office:word" xmlns:w="http://schemas.openxmlformats.org/wordprocessingml/2006/main" xmlns:w14="http://schemas.microsoft.com/office/word/2010/wordml" xmlns:w15="http://schemas.microsoft.com/office/word/2012/wordml" xmlns:w16cex="http://schemas.microsoft.com/office/word/2018/wordml/cex" xmlns:w16cid="http://schemas.microsoft.com/office/word/2016/wordml/cid" xmlns:w16="http://schemas.microsoft.com/office/word/2018/wordml" xmlns:w16sdtdh="http://schemas.microsoft.com/office/word/2020/wordml/sdtdatahash" xmlns:w16se="http://schemas.microsoft.com/office/word/2015/wordml/symex" xmlns:wpg="http://schemas.microsoft.com/office/word/2010/wordprocessingGroup" xmlns:wpi="http://schemas.microsoft.com/office/word/2010/wordprocessingInk" xmlns:wne="http://schemas.microsoft.com/office/word/2006/wordml" xmlns:wps="http://schemas.microsoft.com/office/word/2010/wordprocessingShape" mc:Ignorable="w14 w15 w16se w16cid w16 w16cex w16sdtdh wp14">
+<w:footnotes xmlns:wpc="http://schemas.microsoft.com/office/word/2010/wordprocessingCanvas" xmlns:cx="http://schemas.microsoft.com/office/drawing/2014/chartex" xmlns:mc="http://schemas.openxmlformats.org/markup-compatibility/2006" xmlns:o="urn:schemas-microsoft-com:office:office" xmlns:r="http://schemas.openxmlformats.org/officeDocument/2006/relationships" xmlns:m="http://schemas.openxmlformats.org/officeDocument/2006/math" xmlns:v="urn:schemas-microsoft-com:vml" xmlns:wp14="http://schemas.microsoft.com/office/word/2010/wordprocessingDrawing" xmlns:wp="http://schemas.openxmlformats.org/drawingml/2006/wordprocessingDrawing" xmlns:w10="urn:schemas-microsoft-com:office:word" xmlns:w="http://schemas.openxmlformats.org/wordprocessingml/2006/main" xmlns:w14="http://schemas.microsoft.com/office/word/2010/wordml" xmlns:w15="http://schemas.microsoft.com/office/word/2012/wordml" xmlns:w16se="http://schemas.microsoft.com/office/word/2015/wordml/symex" xmlns:wpg="http://schemas.microsoft.com/office/word/2010/wordprocessingGroup" xmlns:wpi="http://schemas.microsoft.com/office/word/2010/wordprocessingInk" xmlns:wne="http://schemas.microsoft.com/office/word/2006/wordml" xmlns:wps="http://schemas.microsoft.com/office/word/2010/wordprocessingShape" mc:Ignorable="w14 w15 w16se wp14">
   <w:footnote w:type="separator" w:id="-1">
     <w:p>
       <w:pPr>
@@ -9111,7 +9303,7 @@
 </file>
 
 <file path=word/header1.xml><?xml version="1.0" encoding="utf-8"?>
-<w:hdr xmlns:wpc="http://schemas.microsoft.com/office/word/2010/wordprocessingCanvas" xmlns:cx="http://schemas.microsoft.com/office/drawing/2014/chartex" xmlns:cx1="http://schemas.microsoft.com/office/drawing/2015/9/8/chartex" xmlns:cx2="http://schemas.microsoft.com/office/drawing/2015/10/21/chartex" xmlns:cx3="http://schemas.microsoft.com/office/drawing/2016/5/9/chartex" xmlns:cx4="http://schemas.microsoft.com/office/drawing/2016/5/10/chartex" xmlns:cx5="http://schemas.microsoft.com/office/drawing/2016/5/11/chartex" xmlns:cx6="http://schemas.microsoft.com/office/drawing/2016/5/12/chartex" xmlns:cx7="http://schemas.microsoft.com/office/drawing/2016/5/13/chartex" xmlns:cx8="http://schemas.microsoft.com/office/drawing/2016/5/14/chartex" xmlns:mc="http://schemas.openxmlformats.org/markup-compatibility/2006" xmlns:aink="http://schemas.microsoft.com/office/drawing/2016/ink" xmlns:am3d="http://schemas.microsoft.com/office/drawing/2017/model3d" xmlns:o="urn:schemas-microsoft-com:office:office" xmlns:oel="http://schemas.microsoft.com/office/2019/extlst" xmlns:r="http://schemas.openxmlformats.org/officeDocument/2006/relationships" xmlns:m="http://schemas.openxmlformats.org/officeDocument/2006/math" xmlns:v="urn:schemas-microsoft-com:vml" xmlns:wp14="http://schemas.microsoft.com/office/word/2010/wordprocessingDrawing" xmlns:wp="http://schemas.openxmlformats.org/drawingml/2006/wordprocessingDrawing" xmlns:w10="urn:schemas-microsoft-com:office:word" xmlns:w="http://schemas.openxmlformats.org/wordprocessingml/2006/main" xmlns:w14="http://schemas.microsoft.com/office/word/2010/wordml" xmlns:w15="http://schemas.microsoft.com/office/word/2012/wordml" xmlns:w16cex="http://schemas.microsoft.com/office/word/2018/wordml/cex" xmlns:w16cid="http://schemas.microsoft.com/office/word/2016/wordml/cid" xmlns:w16="http://schemas.microsoft.com/office/word/2018/wordml" xmlns:w16sdtdh="http://schemas.microsoft.com/office/word/2020/wordml/sdtdatahash" xmlns:w16se="http://schemas.microsoft.com/office/word/2015/wordml/symex" xmlns:wpg="http://schemas.microsoft.com/office/word/2010/wordprocessingGroup" xmlns:wpi="http://schemas.microsoft.com/office/word/2010/wordprocessingInk" xmlns:wne="http://schemas.microsoft.com/office/word/2006/wordml" xmlns:wps="http://schemas.microsoft.com/office/word/2010/wordprocessingShape" mc:Ignorable="w14 w15 w16se w16cid w16 w16cex w16sdtdh wp14">
+<w:hdr xmlns:wpc="http://schemas.microsoft.com/office/word/2010/wordprocessingCanvas" xmlns:cx="http://schemas.microsoft.com/office/drawing/2014/chartex" xmlns:mc="http://schemas.openxmlformats.org/markup-compatibility/2006" xmlns:o="urn:schemas-microsoft-com:office:office" xmlns:r="http://schemas.openxmlformats.org/officeDocument/2006/relationships" xmlns:m="http://schemas.openxmlformats.org/officeDocument/2006/math" xmlns:v="urn:schemas-microsoft-com:vml" xmlns:wp14="http://schemas.microsoft.com/office/word/2010/wordprocessingDrawing" xmlns:wp="http://schemas.openxmlformats.org/drawingml/2006/wordprocessingDrawing" xmlns:w10="urn:schemas-microsoft-com:office:word" xmlns:w="http://schemas.openxmlformats.org/wordprocessingml/2006/main" xmlns:w14="http://schemas.microsoft.com/office/word/2010/wordml" xmlns:w15="http://schemas.microsoft.com/office/word/2012/wordml" xmlns:w16se="http://schemas.microsoft.com/office/word/2015/wordml/symex" xmlns:wpg="http://schemas.microsoft.com/office/word/2010/wordprocessingGroup" xmlns:wpi="http://schemas.microsoft.com/office/word/2010/wordprocessingInk" xmlns:wne="http://schemas.microsoft.com/office/word/2006/wordml" xmlns:wps="http://schemas.microsoft.com/office/word/2010/wordprocessingShape" mc:Ignorable="w14 w15 w16se wp14">
   <w:p>
     <w:pPr>
       <w:spacing w:after="160" w:line="259" w:lineRule="auto"/>
@@ -9123,7 +9315,7 @@
 </file>
 
 <file path=word/header2.xml><?xml version="1.0" encoding="utf-8"?>
-<w:hdr xmlns:wpc="http://schemas.microsoft.com/office/word/2010/wordprocessingCanvas" xmlns:cx="http://schemas.microsoft.com/office/drawing/2014/chartex" xmlns:cx1="http://schemas.microsoft.com/office/drawing/2015/9/8/chartex" xmlns:cx2="http://schemas.microsoft.com/office/drawing/2015/10/21/chartex" xmlns:cx3="http://schemas.microsoft.com/office/drawing/2016/5/9/chartex" xmlns:cx4="http://schemas.microsoft.com/office/drawing/2016/5/10/chartex" xmlns:cx5="http://schemas.microsoft.com/office/drawing/2016/5/11/chartex" xmlns:cx6="http://schemas.microsoft.com/office/drawing/2016/5/12/chartex" xmlns:cx7="http://schemas.microsoft.com/office/drawing/2016/5/13/chartex" xmlns:cx8="http://schemas.microsoft.com/office/drawing/2016/5/14/chartex" xmlns:mc="http://schemas.openxmlformats.org/markup-compatibility/2006" xmlns:aink="http://schemas.microsoft.com/office/drawing/2016/ink" xmlns:am3d="http://schemas.microsoft.com/office/drawing/2017/model3d" xmlns:o="urn:schemas-microsoft-com:office:office" xmlns:oel="http://schemas.microsoft.com/office/2019/extlst" xmlns:r="http://schemas.openxmlformats.org/officeDocument/2006/relationships" xmlns:m="http://schemas.openxmlformats.org/officeDocument/2006/math" xmlns:v="urn:schemas-microsoft-com:vml" xmlns:wp14="http://schemas.microsoft.com/office/word/2010/wordprocessingDrawing" xmlns:wp="http://schemas.openxmlformats.org/drawingml/2006/wordprocessingDrawing" xmlns:w10="urn:schemas-microsoft-com:office:word" xmlns:w="http://schemas.openxmlformats.org/wordprocessingml/2006/main" xmlns:w14="http://schemas.microsoft.com/office/word/2010/wordml" xmlns:w15="http://schemas.microsoft.com/office/word/2012/wordml" xmlns:w16cex="http://schemas.microsoft.com/office/word/2018/wordml/cex" xmlns:w16cid="http://schemas.microsoft.com/office/word/2016/wordml/cid" xmlns:w16="http://schemas.microsoft.com/office/word/2018/wordml" xmlns:w16sdtdh="http://schemas.microsoft.com/office/word/2020/wordml/sdtdatahash" xmlns:w16se="http://schemas.microsoft.com/office/word/2015/wordml/symex" xmlns:wpg="http://schemas.microsoft.com/office/word/2010/wordprocessingGroup" xmlns:wpi="http://schemas.microsoft.com/office/word/2010/wordprocessingInk" xmlns:wne="http://schemas.microsoft.com/office/word/2006/wordml" xmlns:wps="http://schemas.microsoft.com/office/word/2010/wordprocessingShape" mc:Ignorable="w14 w15 w16se w16cid w16 w16cex w16sdtdh wp14">
+<w:hdr xmlns:wpc="http://schemas.microsoft.com/office/word/2010/wordprocessingCanvas" xmlns:cx="http://schemas.microsoft.com/office/drawing/2014/chartex" xmlns:mc="http://schemas.openxmlformats.org/markup-compatibility/2006" xmlns:o="urn:schemas-microsoft-com:office:office" xmlns:r="http://schemas.openxmlformats.org/officeDocument/2006/relationships" xmlns:m="http://schemas.openxmlformats.org/officeDocument/2006/math" xmlns:v="urn:schemas-microsoft-com:vml" xmlns:wp14="http://schemas.microsoft.com/office/word/2010/wordprocessingDrawing" xmlns:wp="http://schemas.openxmlformats.org/drawingml/2006/wordprocessingDrawing" xmlns:w10="urn:schemas-microsoft-com:office:word" xmlns:w="http://schemas.openxmlformats.org/wordprocessingml/2006/main" xmlns:w14="http://schemas.microsoft.com/office/word/2010/wordml" xmlns:w15="http://schemas.microsoft.com/office/word/2012/wordml" xmlns:w16se="http://schemas.microsoft.com/office/word/2015/wordml/symex" xmlns:wpg="http://schemas.microsoft.com/office/word/2010/wordprocessingGroup" xmlns:wpi="http://schemas.microsoft.com/office/word/2010/wordprocessingInk" xmlns:wne="http://schemas.microsoft.com/office/word/2006/wordml" xmlns:wps="http://schemas.microsoft.com/office/word/2010/wordprocessingShape" mc:Ignorable="w14 w15 w16se wp14">
   <w:p>
     <w:pPr>
       <w:spacing w:after="160" w:line="259" w:lineRule="auto"/>
@@ -9135,7 +9327,7 @@
 </file>
 
 <file path=word/header3.xml><?xml version="1.0" encoding="utf-8"?>
-<w:hdr xmlns:wpc="http://schemas.microsoft.com/office/word/2010/wordprocessingCanvas" xmlns:cx="http://schemas.microsoft.com/office/drawing/2014/chartex" xmlns:cx1="http://schemas.microsoft.com/office/drawing/2015/9/8/chartex" xmlns:cx2="http://schemas.microsoft.com/office/drawing/2015/10/21/chartex" xmlns:cx3="http://schemas.microsoft.com/office/drawing/2016/5/9/chartex" xmlns:cx4="http://schemas.microsoft.com/office/drawing/2016/5/10/chartex" xmlns:cx5="http://schemas.microsoft.com/office/drawing/2016/5/11/chartex" xmlns:cx6="http://schemas.microsoft.com/office/drawing/2016/5/12/chartex" xmlns:cx7="http://schemas.microsoft.com/office/drawing/2016/5/13/chartex" xmlns:cx8="http://schemas.microsoft.com/office/drawing/2016/5/14/chartex" xmlns:mc="http://schemas.openxmlformats.org/markup-compatibility/2006" xmlns:aink="http://schemas.microsoft.com/office/drawing/2016/ink" xmlns:am3d="http://schemas.microsoft.com/office/drawing/2017/model3d" xmlns:o="urn:schemas-microsoft-com:office:office" xmlns:oel="http://schemas.microsoft.com/office/2019/extlst" xmlns:r="http://schemas.openxmlformats.org/officeDocument/2006/relationships" xmlns:m="http://schemas.openxmlformats.org/officeDocument/2006/math" xmlns:v="urn:schemas-microsoft-com:vml" xmlns:wp14="http://schemas.microsoft.com/office/word/2010/wordprocessingDrawing" xmlns:wp="http://schemas.openxmlformats.org/drawingml/2006/wordprocessingDrawing" xmlns:w10="urn:schemas-microsoft-com:office:word" xmlns:w="http://schemas.openxmlformats.org/wordprocessingml/2006/main" xmlns:w14="http://schemas.microsoft.com/office/word/2010/wordml" xmlns:w15="http://schemas.microsoft.com/office/word/2012/wordml" xmlns:w16cex="http://schemas.microsoft.com/office/word/2018/wordml/cex" xmlns:w16cid="http://schemas.microsoft.com/office/word/2016/wordml/cid" xmlns:w16="http://schemas.microsoft.com/office/word/2018/wordml" xmlns:w16sdtdh="http://schemas.microsoft.com/office/word/2020/wordml/sdtdatahash" xmlns:w16se="http://schemas.microsoft.com/office/word/2015/wordml/symex" xmlns:wpg="http://schemas.microsoft.com/office/word/2010/wordprocessingGroup" xmlns:wpi="http://schemas.microsoft.com/office/word/2010/wordprocessingInk" xmlns:wne="http://schemas.microsoft.com/office/word/2006/wordml" xmlns:wps="http://schemas.microsoft.com/office/word/2010/wordprocessingShape" mc:Ignorable="w14 w15 w16se w16cid w16 w16cex w16sdtdh wp14">
+<w:hdr xmlns:wpc="http://schemas.microsoft.com/office/word/2010/wordprocessingCanvas" xmlns:cx="http://schemas.microsoft.com/office/drawing/2014/chartex" xmlns:mc="http://schemas.openxmlformats.org/markup-compatibility/2006" xmlns:o="urn:schemas-microsoft-com:office:office" xmlns:r="http://schemas.openxmlformats.org/officeDocument/2006/relationships" xmlns:m="http://schemas.openxmlformats.org/officeDocument/2006/math" xmlns:v="urn:schemas-microsoft-com:vml" xmlns:wp14="http://schemas.microsoft.com/office/word/2010/wordprocessingDrawing" xmlns:wp="http://schemas.openxmlformats.org/drawingml/2006/wordprocessingDrawing" xmlns:w10="urn:schemas-microsoft-com:office:word" xmlns:w="http://schemas.openxmlformats.org/wordprocessingml/2006/main" xmlns:w14="http://schemas.microsoft.com/office/word/2010/wordml" xmlns:w15="http://schemas.microsoft.com/office/word/2012/wordml" xmlns:w16se="http://schemas.microsoft.com/office/word/2015/wordml/symex" xmlns:wpg="http://schemas.microsoft.com/office/word/2010/wordprocessingGroup" xmlns:wpi="http://schemas.microsoft.com/office/word/2010/wordprocessingInk" xmlns:wne="http://schemas.microsoft.com/office/word/2006/wordml" xmlns:wps="http://schemas.microsoft.com/office/word/2010/wordprocessingShape" mc:Ignorable="w14 w15 w16se wp14">
   <w:p>
     <w:pPr>
       <w:spacing w:after="160" w:line="259" w:lineRule="auto"/>
@@ -9147,7 +9339,7 @@
 </file>
 
 <file path=word/numbering.xml><?xml version="1.0" encoding="utf-8"?>
-<w:numbering xmlns:wpc="http://schemas.microsoft.com/office/word/2010/wordprocessingCanvas" xmlns:cx="http://schemas.microsoft.com/office/drawing/2014/chartex" xmlns:cx1="http://schemas.microsoft.com/office/drawing/2015/9/8/chartex" xmlns:cx2="http://schemas.microsoft.com/office/drawing/2015/10/21/chartex" xmlns:cx3="http://schemas.microsoft.com/office/drawing/2016/5/9/chartex" xmlns:cx4="http://schemas.microsoft.com/office/drawing/2016/5/10/chartex" xmlns:cx5="http://schemas.microsoft.com/office/drawing/2016/5/11/chartex" xmlns:cx6="http://schemas.microsoft.com/office/drawing/2016/5/12/chartex" xmlns:cx7="http://schemas.microsoft.com/office/drawing/2016/5/13/chartex" xmlns:cx8="http://schemas.microsoft.com/office/drawing/2016/5/14/chartex" xmlns:mc="http://schemas.openxmlformats.org/markup-compatibility/2006" xmlns:aink="http://schemas.microsoft.com/office/drawing/2016/ink" xmlns:am3d="http://schemas.microsoft.com/office/drawing/2017/model3d" xmlns:o="urn:schemas-microsoft-com:office:office" xmlns:oel="http://schemas.microsoft.com/office/2019/extlst" xmlns:r="http://schemas.openxmlformats.org/officeDocument/2006/relationships" xmlns:m="http://schemas.openxmlformats.org/officeDocument/2006/math" xmlns:v="urn:schemas-microsoft-com:vml" xmlns:wp14="http://schemas.microsoft.com/office/word/2010/wordprocessingDrawing" xmlns:wp="http://schemas.openxmlformats.org/drawingml/2006/wordprocessingDrawing" xmlns:w10="urn:schemas-microsoft-com:office:word" xmlns:w="http://schemas.openxmlformats.org/wordprocessingml/2006/main" xmlns:w14="http://schemas.microsoft.com/office/word/2010/wordml" xmlns:w15="http://schemas.microsoft.com/office/word/2012/wordml" xmlns:w16cex="http://schemas.microsoft.com/office/word/2018/wordml/cex" xmlns:w16cid="http://schemas.microsoft.com/office/word/2016/wordml/cid" xmlns:w16="http://schemas.microsoft.com/office/word/2018/wordml" xmlns:w16sdtdh="http://schemas.microsoft.com/office/word/2020/wordml/sdtdatahash" xmlns:w16se="http://schemas.microsoft.com/office/word/2015/wordml/symex" xmlns:wpg="http://schemas.microsoft.com/office/word/2010/wordprocessingGroup" xmlns:wpi="http://schemas.microsoft.com/office/word/2010/wordprocessingInk" xmlns:wne="http://schemas.microsoft.com/office/word/2006/wordml" xmlns:wps="http://schemas.microsoft.com/office/word/2010/wordprocessingShape" mc:Ignorable="w14 w15 w16se w16cid w16 w16cex w16sdtdh wp14">
+<w:numbering xmlns:wpc="http://schemas.microsoft.com/office/word/2010/wordprocessingCanvas" xmlns:cx="http://schemas.microsoft.com/office/drawing/2014/chartex" xmlns:mc="http://schemas.openxmlformats.org/markup-compatibility/2006" xmlns:o="urn:schemas-microsoft-com:office:office" xmlns:r="http://schemas.openxmlformats.org/officeDocument/2006/relationships" xmlns:m="http://schemas.openxmlformats.org/officeDocument/2006/math" xmlns:v="urn:schemas-microsoft-com:vml" xmlns:wp14="http://schemas.microsoft.com/office/word/2010/wordprocessingDrawing" xmlns:wp="http://schemas.openxmlformats.org/drawingml/2006/wordprocessingDrawing" xmlns:w10="urn:schemas-microsoft-com:office:word" xmlns:w="http://schemas.openxmlformats.org/wordprocessingml/2006/main" xmlns:w14="http://schemas.microsoft.com/office/word/2010/wordml" xmlns:w15="http://schemas.microsoft.com/office/word/2012/wordml" xmlns:w16se="http://schemas.microsoft.com/office/word/2015/wordml/symex" xmlns:wpg="http://schemas.microsoft.com/office/word/2010/wordprocessingGroup" xmlns:wpi="http://schemas.microsoft.com/office/word/2010/wordprocessingInk" xmlns:wne="http://schemas.microsoft.com/office/word/2006/wordml" xmlns:wps="http://schemas.microsoft.com/office/word/2010/wordprocessingShape" mc:Ignorable="w14 w15 w16se wp14">
   <w:abstractNum w:abstractNumId="0" w15:restartNumberingAfterBreak="0">
     <w:nsid w:val="0DCC02BD"/>
     <w:multiLevelType w:val="hybridMultilevel"/>
@@ -9600,23 +9792,23 @@
       </w:rPr>
     </w:lvl>
   </w:abstractNum>
-  <w:num w:numId="1" w16cid:durableId="697630878">
+  <w:num w:numId="1">
     <w:abstractNumId w:val="3"/>
   </w:num>
-  <w:num w:numId="2" w16cid:durableId="894389949">
+  <w:num w:numId="2">
     <w:abstractNumId w:val="0"/>
   </w:num>
-  <w:num w:numId="3" w16cid:durableId="2133746857">
+  <w:num w:numId="3">
     <w:abstractNumId w:val="1"/>
   </w:num>
-  <w:num w:numId="4" w16cid:durableId="733041603">
+  <w:num w:numId="4">
     <w:abstractNumId w:val="2"/>
   </w:num>
 </w:numbering>
 </file>
 
 <file path=word/styles.xml><?xml version="1.0" encoding="utf-8"?>
-<w:styles xmlns:mc="http://schemas.openxmlformats.org/markup-compatibility/2006" xmlns:r="http://schemas.openxmlformats.org/officeDocument/2006/relationships" xmlns:w="http://schemas.openxmlformats.org/wordprocessingml/2006/main" xmlns:w14="http://schemas.microsoft.com/office/word/2010/wordml" xmlns:w15="http://schemas.microsoft.com/office/word/2012/wordml" xmlns:w16cex="http://schemas.microsoft.com/office/word/2018/wordml/cex" xmlns:w16cid="http://schemas.microsoft.com/office/word/2016/wordml/cid" xmlns:w16="http://schemas.microsoft.com/office/word/2018/wordml" xmlns:w16sdtdh="http://schemas.microsoft.com/office/word/2020/wordml/sdtdatahash" xmlns:w16se="http://schemas.microsoft.com/office/word/2015/wordml/symex" mc:Ignorable="w14 w15 w16se w16cid w16 w16cex w16sdtdh">
+<w:styles xmlns:mc="http://schemas.openxmlformats.org/markup-compatibility/2006" xmlns:r="http://schemas.openxmlformats.org/officeDocument/2006/relationships" xmlns:w="http://schemas.openxmlformats.org/wordprocessingml/2006/main" xmlns:w14="http://schemas.microsoft.com/office/word/2010/wordml" xmlns:w15="http://schemas.microsoft.com/office/word/2012/wordml" xmlns:w16se="http://schemas.microsoft.com/office/word/2015/wordml/symex" mc:Ignorable="w14 w15 w16se">
   <w:docDefaults>
     <w:rPrDefault>
       <w:rPr>
@@ -9632,7 +9824,7 @@
       </w:pPr>
     </w:pPrDefault>
   </w:docDefaults>
-  <w:latentStyles w:defLockedState="0" w:defUIPriority="99" w:defSemiHidden="0" w:defUnhideWhenUsed="0" w:defQFormat="0" w:count="376">
+  <w:latentStyles w:defLockedState="0" w:defUIPriority="99" w:defSemiHidden="0" w:defUnhideWhenUsed="0" w:defQFormat="0" w:count="371">
     <w:lsdException w:name="Normal" w:uiPriority="0" w:qFormat="1"/>
     <w:lsdException w:name="heading 1" w:uiPriority="9" w:qFormat="1"/>
     <w:lsdException w:name="heading 2" w:semiHidden="1" w:uiPriority="9" w:unhideWhenUsed="1" w:qFormat="1"/>
@@ -10004,11 +10196,6 @@
     <w:lsdException w:name="List Table 5 Dark Accent 6" w:uiPriority="50"/>
     <w:lsdException w:name="List Table 6 Colorful Accent 6" w:uiPriority="51"/>
     <w:lsdException w:name="List Table 7 Colorful Accent 6" w:uiPriority="52"/>
-    <w:lsdException w:name="Mention" w:semiHidden="1" w:unhideWhenUsed="1"/>
-    <w:lsdException w:name="Smart Hyperlink" w:semiHidden="1" w:unhideWhenUsed="1"/>
-    <w:lsdException w:name="Hashtag" w:semiHidden="1" w:unhideWhenUsed="1"/>
-    <w:lsdException w:name="Unresolved Mention" w:semiHidden="1" w:unhideWhenUsed="1"/>
-    <w:lsdException w:name="Smart Link" w:semiHidden="1" w:unhideWhenUsed="1"/>
   </w:latentStyles>
   <w:style w:type="paragraph" w:default="1" w:styleId="Normal">
     <w:name w:val="Normal"/>
@@ -10471,7 +10658,7 @@
       <w:szCs w:val="20"/>
     </w:rPr>
   </w:style>
-  <w:style w:type="table" w:styleId="TabelaSimples-1">
+  <w:style w:type="table" w:styleId="Tabelasimples1">
     <w:name w:val="Table Simple 1"/>
     <w:basedOn w:val="Tabelanormal"/>
     <w:tblPr>
@@ -10769,9 +10956,8 @@
 </file>
 
 <file path=customXml/itemProps1.xml><?xml version="1.0" encoding="utf-8"?>
-<ds:datastoreItem xmlns:ds="http://schemas.openxmlformats.org/officeDocument/2006/customXml" ds:itemID="{0B3301D5-5BB4-409E-A8AE-5220B58CEC21}">
+<ds:datastoreItem xmlns:ds="http://schemas.openxmlformats.org/officeDocument/2006/customXml" ds:itemID="{5611ACEF-5578-4F76-906D-B4E4FB177C94}">
   <ds:schemaRefs>
-    <ds:schemaRef ds:uri="http://schemas.microsoft.com/vsto/samples"/>
     <ds:schemaRef ds:uri="http://schemas.openxmlformats.org/officeDocument/2006/bibliography"/>
   </ds:schemaRefs>
 </ds:datastoreItem>

</xml_diff>